<commit_message>
docs: added new version of bericht and deleted time sheet since it is on onedrive
</commit_message>
<xml_diff>
--- a/Dokumente/IPA_Bericht_Ruben_Schneebeli_V2.docx
+++ b/Dokumente/IPA_Bericht_Ruben_Schneebeli_V2.docx
@@ -1026,7 +1026,7 @@
             </w:rPr>
             <w:fldChar w:fldCharType="separate"/>
           </w:r>
-          <w:hyperlink w:anchor="_Toc226533039" w:history="1">
+          <w:hyperlink w:anchor="_Toc226552598" w:history="1">
             <w:r>
               <w:rPr>
                 <w:rStyle w:val="Hyperlink"/>
@@ -1054,7 +1054,7 @@
                 <w:noProof/>
                 <w:webHidden/>
               </w:rPr>
-              <w:instrText xml:space="preserve"> PAGEREF _Toc226533039 \h </w:instrText>
+              <w:instrText xml:space="preserve"> PAGEREF _Toc226552598 \h </w:instrText>
             </w:r>
             <w:r>
               <w:rPr>
@@ -1101,7 +1101,7 @@
               <w:lang w:val="en-CH" w:eastAsia="en-GB"/>
             </w:rPr>
           </w:pPr>
-          <w:hyperlink w:anchor="_Toc226533040" w:history="1">
+          <w:hyperlink w:anchor="_Toc226552599" w:history="1">
             <w:r>
               <w:rPr>
                 <w:rStyle w:val="Hyperlink"/>
@@ -1128,7 +1128,7 @@
                 <w:noProof/>
                 <w:webHidden/>
               </w:rPr>
-              <w:instrText xml:space="preserve"> PAGEREF _Toc226533040 \h </w:instrText>
+              <w:instrText xml:space="preserve"> PAGEREF _Toc226552599 \h </w:instrText>
             </w:r>
             <w:r>
               <w:rPr>
@@ -1175,7 +1175,7 @@
               <w:lang w:val="en-CH" w:eastAsia="en-GB"/>
             </w:rPr>
           </w:pPr>
-          <w:hyperlink w:anchor="_Toc226533041" w:history="1">
+          <w:hyperlink w:anchor="_Toc226552600" w:history="1">
             <w:r>
               <w:rPr>
                 <w:rStyle w:val="Hyperlink"/>
@@ -1202,7 +1202,7 @@
                 <w:noProof/>
                 <w:webHidden/>
               </w:rPr>
-              <w:instrText xml:space="preserve"> PAGEREF _Toc226533041 \h </w:instrText>
+              <w:instrText xml:space="preserve"> PAGEREF _Toc226552600 \h </w:instrText>
             </w:r>
             <w:r>
               <w:rPr>
@@ -1249,7 +1249,7 @@
               <w:lang w:val="en-CH" w:eastAsia="en-GB"/>
             </w:rPr>
           </w:pPr>
-          <w:hyperlink w:anchor="_Toc226533042" w:history="1">
+          <w:hyperlink w:anchor="_Toc226552601" w:history="1">
             <w:r>
               <w:rPr>
                 <w:rStyle w:val="Hyperlink"/>
@@ -1276,7 +1276,7 @@
                 <w:noProof/>
                 <w:webHidden/>
               </w:rPr>
-              <w:instrText xml:space="preserve"> PAGEREF _Toc226533042 \h </w:instrText>
+              <w:instrText xml:space="preserve"> PAGEREF _Toc226552601 \h </w:instrText>
             </w:r>
             <w:r>
               <w:rPr>
@@ -1323,7 +1323,7 @@
               <w:lang w:val="en-CH" w:eastAsia="en-GB"/>
             </w:rPr>
           </w:pPr>
-          <w:hyperlink w:anchor="_Toc226533043" w:history="1">
+          <w:hyperlink w:anchor="_Toc226552602" w:history="1">
             <w:r>
               <w:rPr>
                 <w:rStyle w:val="Hyperlink"/>
@@ -1350,7 +1350,7 @@
                 <w:noProof/>
                 <w:webHidden/>
               </w:rPr>
-              <w:instrText xml:space="preserve"> PAGEREF _Toc226533043 \h </w:instrText>
+              <w:instrText xml:space="preserve"> PAGEREF _Toc226552602 \h </w:instrText>
             </w:r>
             <w:r>
               <w:rPr>
@@ -1395,7 +1395,7 @@
               <w:lang w:val="en-CH" w:eastAsia="en-GB"/>
             </w:rPr>
           </w:pPr>
-          <w:hyperlink w:anchor="_Toc226533044" w:history="1">
+          <w:hyperlink w:anchor="_Toc226552603" w:history="1">
             <w:r>
               <w:rPr>
                 <w:rStyle w:val="Hyperlink"/>
@@ -1424,7 +1424,7 @@
                 <w:noProof/>
                 <w:webHidden/>
               </w:rPr>
-              <w:instrText xml:space="preserve"> PAGEREF _Toc226533044 \h </w:instrText>
+              <w:instrText xml:space="preserve"> PAGEREF _Toc226552603 \h </w:instrText>
             </w:r>
             <w:r>
               <w:rPr>
@@ -1469,7 +1469,7 @@
               <w:lang w:val="en-CH" w:eastAsia="en-GB"/>
             </w:rPr>
           </w:pPr>
-          <w:hyperlink w:anchor="_Toc226533045" w:history="1">
+          <w:hyperlink w:anchor="_Toc226552604" w:history="1">
             <w:r>
               <w:rPr>
                 <w:rStyle w:val="Hyperlink"/>
@@ -1498,7 +1498,7 @@
                 <w:noProof/>
                 <w:webHidden/>
               </w:rPr>
-              <w:instrText xml:space="preserve"> PAGEREF _Toc226533045 \h </w:instrText>
+              <w:instrText xml:space="preserve"> PAGEREF _Toc226552604 \h </w:instrText>
             </w:r>
             <w:r>
               <w:rPr>
@@ -1543,7 +1543,7 @@
               <w:lang w:val="en-CH" w:eastAsia="en-GB"/>
             </w:rPr>
           </w:pPr>
-          <w:hyperlink w:anchor="_Toc226533046" w:history="1">
+          <w:hyperlink w:anchor="_Toc226552605" w:history="1">
             <w:r>
               <w:rPr>
                 <w:rStyle w:val="Hyperlink"/>
@@ -1572,7 +1572,7 @@
                 <w:noProof/>
                 <w:webHidden/>
               </w:rPr>
-              <w:instrText xml:space="preserve"> PAGEREF _Toc226533046 \h </w:instrText>
+              <w:instrText xml:space="preserve"> PAGEREF _Toc226552605 \h </w:instrText>
             </w:r>
             <w:r>
               <w:rPr>
@@ -1619,7 +1619,7 @@
               <w:lang w:val="en-CH" w:eastAsia="en-GB"/>
             </w:rPr>
           </w:pPr>
-          <w:hyperlink w:anchor="_Toc226533047" w:history="1">
+          <w:hyperlink w:anchor="_Toc226552606" w:history="1">
             <w:r>
               <w:rPr>
                 <w:rStyle w:val="Hyperlink"/>
@@ -1646,7 +1646,7 @@
                 <w:noProof/>
                 <w:webHidden/>
               </w:rPr>
-              <w:instrText xml:space="preserve"> PAGEREF _Toc226533047 \h </w:instrText>
+              <w:instrText xml:space="preserve"> PAGEREF _Toc226552606 \h </w:instrText>
             </w:r>
             <w:r>
               <w:rPr>
@@ -1693,7 +1693,7 @@
               <w:lang w:val="en-CH" w:eastAsia="en-GB"/>
             </w:rPr>
           </w:pPr>
-          <w:hyperlink w:anchor="_Toc226533048" w:history="1">
+          <w:hyperlink w:anchor="_Toc226552607" w:history="1">
             <w:r>
               <w:rPr>
                 <w:rStyle w:val="Hyperlink"/>
@@ -1720,7 +1720,7 @@
                 <w:noProof/>
                 <w:webHidden/>
               </w:rPr>
-              <w:instrText xml:space="preserve"> PAGEREF _Toc226533048 \h </w:instrText>
+              <w:instrText xml:space="preserve"> PAGEREF _Toc226552607 \h </w:instrText>
             </w:r>
             <w:r>
               <w:rPr>
@@ -1767,7 +1767,7 @@
               <w:lang w:val="en-CH" w:eastAsia="en-GB"/>
             </w:rPr>
           </w:pPr>
-          <w:hyperlink w:anchor="_Toc226533049" w:history="1">
+          <w:hyperlink w:anchor="_Toc226552608" w:history="1">
             <w:r>
               <w:rPr>
                 <w:rStyle w:val="Hyperlink"/>
@@ -1794,7 +1794,7 @@
                 <w:noProof/>
                 <w:webHidden/>
               </w:rPr>
-              <w:instrText xml:space="preserve"> PAGEREF _Toc226533049 \h </w:instrText>
+              <w:instrText xml:space="preserve"> PAGEREF _Toc226552608 \h </w:instrText>
             </w:r>
             <w:r>
               <w:rPr>
@@ -1841,7 +1841,7 @@
               <w:lang w:val="en-CH" w:eastAsia="en-GB"/>
             </w:rPr>
           </w:pPr>
-          <w:hyperlink w:anchor="_Toc226533050" w:history="1">
+          <w:hyperlink w:anchor="_Toc226552609" w:history="1">
             <w:r>
               <w:rPr>
                 <w:rStyle w:val="Hyperlink"/>
@@ -1868,7 +1868,7 @@
                 <w:noProof/>
                 <w:webHidden/>
               </w:rPr>
-              <w:instrText xml:space="preserve"> PAGEREF _Toc226533050 \h </w:instrText>
+              <w:instrText xml:space="preserve"> PAGEREF _Toc226552609 \h </w:instrText>
             </w:r>
             <w:r>
               <w:rPr>
@@ -1915,7 +1915,7 @@
               <w:lang w:val="en-CH" w:eastAsia="en-GB"/>
             </w:rPr>
           </w:pPr>
-          <w:hyperlink w:anchor="_Toc226533051" w:history="1">
+          <w:hyperlink w:anchor="_Toc226552610" w:history="1">
             <w:r>
               <w:rPr>
                 <w:rStyle w:val="Hyperlink"/>
@@ -1942,7 +1942,7 @@
                 <w:noProof/>
                 <w:webHidden/>
               </w:rPr>
-              <w:instrText xml:space="preserve"> PAGEREF _Toc226533051 \h </w:instrText>
+              <w:instrText xml:space="preserve"> PAGEREF _Toc226552610 \h </w:instrText>
             </w:r>
             <w:r>
               <w:rPr>
@@ -1989,7 +1989,7 @@
               <w:lang w:val="en-CH" w:eastAsia="en-GB"/>
             </w:rPr>
           </w:pPr>
-          <w:hyperlink w:anchor="_Toc226533052" w:history="1">
+          <w:hyperlink w:anchor="_Toc226552611" w:history="1">
             <w:r>
               <w:rPr>
                 <w:rStyle w:val="Hyperlink"/>
@@ -2016,7 +2016,7 @@
                 <w:noProof/>
                 <w:webHidden/>
               </w:rPr>
-              <w:instrText xml:space="preserve"> PAGEREF _Toc226533052 \h </w:instrText>
+              <w:instrText xml:space="preserve"> PAGEREF _Toc226552611 \h </w:instrText>
             </w:r>
             <w:r>
               <w:rPr>
@@ -2036,7 +2036,7 @@
                 <w:noProof/>
                 <w:webHidden/>
               </w:rPr>
-              <w:t>13</w:t>
+              <w:t>14</w:t>
             </w:r>
             <w:r>
               <w:rPr>
@@ -2063,7 +2063,7 @@
               <w:lang w:val="en-CH" w:eastAsia="en-GB"/>
             </w:rPr>
           </w:pPr>
-          <w:hyperlink w:anchor="_Toc226533053" w:history="1">
+          <w:hyperlink w:anchor="_Toc226552612" w:history="1">
             <w:r>
               <w:rPr>
                 <w:rStyle w:val="Hyperlink"/>
@@ -2090,7 +2090,7 @@
                 <w:noProof/>
                 <w:webHidden/>
               </w:rPr>
-              <w:instrText xml:space="preserve"> PAGEREF _Toc226533053 \h </w:instrText>
+              <w:instrText xml:space="preserve"> PAGEREF _Toc226552612 \h </w:instrText>
             </w:r>
             <w:r>
               <w:rPr>
@@ -2110,7 +2110,7 @@
                 <w:noProof/>
                 <w:webHidden/>
               </w:rPr>
-              <w:t>13</w:t>
+              <w:t>14</w:t>
             </w:r>
             <w:r>
               <w:rPr>
@@ -2137,7 +2137,7 @@
               <w:lang w:val="en-CH" w:eastAsia="en-GB"/>
             </w:rPr>
           </w:pPr>
-          <w:hyperlink w:anchor="_Toc226533054" w:history="1">
+          <w:hyperlink w:anchor="_Toc226552613" w:history="1">
             <w:r>
               <w:rPr>
                 <w:rStyle w:val="Hyperlink"/>
@@ -2164,7 +2164,7 @@
                 <w:noProof/>
                 <w:webHidden/>
               </w:rPr>
-              <w:instrText xml:space="preserve"> PAGEREF _Toc226533054 \h </w:instrText>
+              <w:instrText xml:space="preserve"> PAGEREF _Toc226552613 \h </w:instrText>
             </w:r>
             <w:r>
               <w:rPr>
@@ -2184,7 +2184,7 @@
                 <w:noProof/>
                 <w:webHidden/>
               </w:rPr>
-              <w:t>13</w:t>
+              <w:t>14</w:t>
             </w:r>
             <w:r>
               <w:rPr>
@@ -2211,7 +2211,7 @@
               <w:lang w:val="en-CH" w:eastAsia="en-GB"/>
             </w:rPr>
           </w:pPr>
-          <w:hyperlink w:anchor="_Toc226533055" w:history="1">
+          <w:hyperlink w:anchor="_Toc226552614" w:history="1">
             <w:r>
               <w:rPr>
                 <w:rStyle w:val="Hyperlink"/>
@@ -2238,7 +2238,7 @@
                 <w:noProof/>
                 <w:webHidden/>
               </w:rPr>
-              <w:instrText xml:space="preserve"> PAGEREF _Toc226533055 \h </w:instrText>
+              <w:instrText xml:space="preserve"> PAGEREF _Toc226552614 \h </w:instrText>
             </w:r>
             <w:r>
               <w:rPr>
@@ -2258,7 +2258,7 @@
                 <w:noProof/>
                 <w:webHidden/>
               </w:rPr>
-              <w:t>13</w:t>
+              <w:t>14</w:t>
             </w:r>
             <w:r>
               <w:rPr>
@@ -2285,7 +2285,7 @@
               <w:lang w:val="en-CH" w:eastAsia="en-GB"/>
             </w:rPr>
           </w:pPr>
-          <w:hyperlink w:anchor="_Toc226533056" w:history="1">
+          <w:hyperlink w:anchor="_Toc226552615" w:history="1">
             <w:r>
               <w:rPr>
                 <w:rStyle w:val="Hyperlink"/>
@@ -2312,7 +2312,7 @@
                 <w:noProof/>
                 <w:webHidden/>
               </w:rPr>
-              <w:instrText xml:space="preserve"> PAGEREF _Toc226533056 \h </w:instrText>
+              <w:instrText xml:space="preserve"> PAGEREF _Toc226552615 \h </w:instrText>
             </w:r>
             <w:r>
               <w:rPr>
@@ -2332,7 +2332,7 @@
                 <w:noProof/>
                 <w:webHidden/>
               </w:rPr>
-              <w:t>13</w:t>
+              <w:t>14</w:t>
             </w:r>
             <w:r>
               <w:rPr>
@@ -2359,7 +2359,7 @@
               <w:lang w:val="en-CH" w:eastAsia="en-GB"/>
             </w:rPr>
           </w:pPr>
-          <w:hyperlink w:anchor="_Toc226533057" w:history="1">
+          <w:hyperlink w:anchor="_Toc226552616" w:history="1">
             <w:r>
               <w:rPr>
                 <w:rStyle w:val="Hyperlink"/>
@@ -2387,7 +2387,7 @@
                 <w:noProof/>
                 <w:webHidden/>
               </w:rPr>
-              <w:instrText xml:space="preserve"> PAGEREF _Toc226533057 \h </w:instrText>
+              <w:instrText xml:space="preserve"> PAGEREF _Toc226552616 \h </w:instrText>
             </w:r>
             <w:r>
               <w:rPr>
@@ -2407,7 +2407,7 @@
                 <w:noProof/>
                 <w:webHidden/>
               </w:rPr>
-              <w:t>14</w:t>
+              <w:t>15</w:t>
             </w:r>
             <w:r>
               <w:rPr>
@@ -2434,7 +2434,7 @@
               <w:lang w:val="en-CH" w:eastAsia="en-GB"/>
             </w:rPr>
           </w:pPr>
-          <w:hyperlink w:anchor="_Toc226533058" w:history="1">
+          <w:hyperlink w:anchor="_Toc226552617" w:history="1">
             <w:r>
               <w:rPr>
                 <w:rStyle w:val="Hyperlink"/>
@@ -2461,7 +2461,7 @@
                 <w:noProof/>
                 <w:webHidden/>
               </w:rPr>
-              <w:instrText xml:space="preserve"> PAGEREF _Toc226533058 \h </w:instrText>
+              <w:instrText xml:space="preserve"> PAGEREF _Toc226552617 \h </w:instrText>
             </w:r>
             <w:r>
               <w:rPr>
@@ -2481,7 +2481,7 @@
                 <w:noProof/>
                 <w:webHidden/>
               </w:rPr>
-              <w:t>14</w:t>
+              <w:t>15</w:t>
             </w:r>
             <w:r>
               <w:rPr>
@@ -2508,7 +2508,7 @@
               <w:lang w:val="en-CH" w:eastAsia="en-GB"/>
             </w:rPr>
           </w:pPr>
-          <w:hyperlink w:anchor="_Toc226533059" w:history="1">
+          <w:hyperlink w:anchor="_Toc226552618" w:history="1">
             <w:r>
               <w:rPr>
                 <w:rStyle w:val="Hyperlink"/>
@@ -2535,7 +2535,7 @@
                 <w:noProof/>
                 <w:webHidden/>
               </w:rPr>
-              <w:instrText xml:space="preserve"> PAGEREF _Toc226533059 \h </w:instrText>
+              <w:instrText xml:space="preserve"> PAGEREF _Toc226552618 \h </w:instrText>
             </w:r>
             <w:r>
               <w:rPr>
@@ -2555,7 +2555,7 @@
                 <w:noProof/>
                 <w:webHidden/>
               </w:rPr>
-              <w:t>15</w:t>
+              <w:t>16</w:t>
             </w:r>
             <w:r>
               <w:rPr>
@@ -2582,7 +2582,7 @@
               <w:lang w:val="en-CH" w:eastAsia="en-GB"/>
             </w:rPr>
           </w:pPr>
-          <w:hyperlink w:anchor="_Toc226533060" w:history="1">
+          <w:hyperlink w:anchor="_Toc226552619" w:history="1">
             <w:r>
               <w:rPr>
                 <w:rStyle w:val="Hyperlink"/>
@@ -2609,7 +2609,7 @@
                 <w:noProof/>
                 <w:webHidden/>
               </w:rPr>
-              <w:instrText xml:space="preserve"> PAGEREF _Toc226533060 \h </w:instrText>
+              <w:instrText xml:space="preserve"> PAGEREF _Toc226552619 \h </w:instrText>
             </w:r>
             <w:r>
               <w:rPr>
@@ -2629,7 +2629,7 @@
                 <w:noProof/>
                 <w:webHidden/>
               </w:rPr>
-              <w:t>15</w:t>
+              <w:t>16</w:t>
             </w:r>
             <w:r>
               <w:rPr>
@@ -2654,7 +2654,7 @@
               <w:lang w:val="en-CH" w:eastAsia="en-GB"/>
             </w:rPr>
           </w:pPr>
-          <w:hyperlink w:anchor="_Toc226533061" w:history="1">
+          <w:hyperlink w:anchor="_Toc226552620" w:history="1">
             <w:r>
               <w:rPr>
                 <w:rStyle w:val="Hyperlink"/>
@@ -2681,7 +2681,7 @@
                 <w:noProof/>
                 <w:webHidden/>
               </w:rPr>
-              <w:instrText xml:space="preserve"> PAGEREF _Toc226533061 \h </w:instrText>
+              <w:instrText xml:space="preserve"> PAGEREF _Toc226552620 \h </w:instrText>
             </w:r>
             <w:r>
               <w:rPr>
@@ -2701,7 +2701,7 @@
                 <w:noProof/>
                 <w:webHidden/>
               </w:rPr>
-              <w:t>15</w:t>
+              <w:t>16</w:t>
             </w:r>
             <w:r>
               <w:rPr>
@@ -2726,7 +2726,7 @@
               <w:lang w:val="en-CH" w:eastAsia="en-GB"/>
             </w:rPr>
           </w:pPr>
-          <w:hyperlink w:anchor="_Toc226533062" w:history="1">
+          <w:hyperlink w:anchor="_Toc226552621" w:history="1">
             <w:r>
               <w:rPr>
                 <w:rStyle w:val="Hyperlink"/>
@@ -2753,7 +2753,7 @@
                 <w:noProof/>
                 <w:webHidden/>
               </w:rPr>
-              <w:instrText xml:space="preserve"> PAGEREF _Toc226533062 \h </w:instrText>
+              <w:instrText xml:space="preserve"> PAGEREF _Toc226552621 \h </w:instrText>
             </w:r>
             <w:r>
               <w:rPr>
@@ -2773,7 +2773,7 @@
                 <w:noProof/>
                 <w:webHidden/>
               </w:rPr>
-              <w:t>15</w:t>
+              <w:t>16</w:t>
             </w:r>
             <w:r>
               <w:rPr>
@@ -2798,7 +2798,7 @@
               <w:lang w:val="en-CH" w:eastAsia="en-GB"/>
             </w:rPr>
           </w:pPr>
-          <w:hyperlink w:anchor="_Toc226533063" w:history="1">
+          <w:hyperlink w:anchor="_Toc226552622" w:history="1">
             <w:r>
               <w:rPr>
                 <w:rStyle w:val="Hyperlink"/>
@@ -2825,7 +2825,7 @@
                 <w:noProof/>
                 <w:webHidden/>
               </w:rPr>
-              <w:instrText xml:space="preserve"> PAGEREF _Toc226533063 \h </w:instrText>
+              <w:instrText xml:space="preserve"> PAGEREF _Toc226552622 \h </w:instrText>
             </w:r>
             <w:r>
               <w:rPr>
@@ -2845,7 +2845,7 @@
                 <w:noProof/>
                 <w:webHidden/>
               </w:rPr>
-              <w:t>16</w:t>
+              <w:t>17</w:t>
             </w:r>
             <w:r>
               <w:rPr>
@@ -2870,7 +2870,7 @@
               <w:lang w:val="en-CH" w:eastAsia="en-GB"/>
             </w:rPr>
           </w:pPr>
-          <w:hyperlink w:anchor="_Toc226533064" w:history="1">
+          <w:hyperlink w:anchor="_Toc226552623" w:history="1">
             <w:r>
               <w:rPr>
                 <w:rStyle w:val="Hyperlink"/>
@@ -2897,7 +2897,7 @@
                 <w:noProof/>
                 <w:webHidden/>
               </w:rPr>
-              <w:instrText xml:space="preserve"> PAGEREF _Toc226533064 \h </w:instrText>
+              <w:instrText xml:space="preserve"> PAGEREF _Toc226552623 \h </w:instrText>
             </w:r>
             <w:r>
               <w:rPr>
@@ -2917,7 +2917,7 @@
                 <w:noProof/>
                 <w:webHidden/>
               </w:rPr>
-              <w:t>17</w:t>
+              <w:t>18</w:t>
             </w:r>
             <w:r>
               <w:rPr>
@@ -2942,7 +2942,7 @@
               <w:lang w:val="en-CH" w:eastAsia="en-GB"/>
             </w:rPr>
           </w:pPr>
-          <w:hyperlink w:anchor="_Toc226533065" w:history="1">
+          <w:hyperlink w:anchor="_Toc226552624" w:history="1">
             <w:r>
               <w:rPr>
                 <w:rStyle w:val="Hyperlink"/>
@@ -2969,7 +2969,7 @@
                 <w:noProof/>
                 <w:webHidden/>
               </w:rPr>
-              <w:instrText xml:space="preserve"> PAGEREF _Toc226533065 \h </w:instrText>
+              <w:instrText xml:space="preserve"> PAGEREF _Toc226552624 \h </w:instrText>
             </w:r>
             <w:r>
               <w:rPr>
@@ -2989,7 +2989,7 @@
                 <w:noProof/>
                 <w:webHidden/>
               </w:rPr>
-              <w:t>18</w:t>
+              <w:t>19</w:t>
             </w:r>
             <w:r>
               <w:rPr>
@@ -3016,7 +3016,7 @@
               <w:lang w:val="en-CH" w:eastAsia="en-GB"/>
             </w:rPr>
           </w:pPr>
-          <w:hyperlink w:anchor="_Toc226533066" w:history="1">
+          <w:hyperlink w:anchor="_Toc226552625" w:history="1">
             <w:r>
               <w:rPr>
                 <w:rStyle w:val="Hyperlink"/>
@@ -3043,7 +3043,7 @@
                 <w:noProof/>
                 <w:webHidden/>
               </w:rPr>
-              <w:instrText xml:space="preserve"> PAGEREF _Toc226533066 \h </w:instrText>
+              <w:instrText xml:space="preserve"> PAGEREF _Toc226552625 \h </w:instrText>
             </w:r>
             <w:r>
               <w:rPr>
@@ -3063,7 +3063,7 @@
                 <w:noProof/>
                 <w:webHidden/>
               </w:rPr>
-              <w:t>19</w:t>
+              <w:t>20</w:t>
             </w:r>
             <w:r>
               <w:rPr>
@@ -3090,7 +3090,7 @@
               <w:lang w:val="en-CH" w:eastAsia="en-GB"/>
             </w:rPr>
           </w:pPr>
-          <w:hyperlink w:anchor="_Toc226533067" w:history="1">
+          <w:hyperlink w:anchor="_Toc226552626" w:history="1">
             <w:r>
               <w:rPr>
                 <w:rStyle w:val="Hyperlink"/>
@@ -3117,7 +3117,7 @@
                 <w:noProof/>
                 <w:webHidden/>
               </w:rPr>
-              <w:instrText xml:space="preserve"> PAGEREF _Toc226533067 \h </w:instrText>
+              <w:instrText xml:space="preserve"> PAGEREF _Toc226552626 \h </w:instrText>
             </w:r>
             <w:r>
               <w:rPr>
@@ -3137,7 +3137,7 @@
                 <w:noProof/>
                 <w:webHidden/>
               </w:rPr>
-              <w:t>20</w:t>
+              <w:t>21</w:t>
             </w:r>
             <w:r>
               <w:rPr>
@@ -3164,7 +3164,7 @@
               <w:lang w:val="en-CH" w:eastAsia="en-GB"/>
             </w:rPr>
           </w:pPr>
-          <w:hyperlink w:anchor="_Toc226533068" w:history="1">
+          <w:hyperlink w:anchor="_Toc226552627" w:history="1">
             <w:r>
               <w:rPr>
                 <w:rStyle w:val="Hyperlink"/>
@@ -3191,7 +3191,7 @@
                 <w:noProof/>
                 <w:webHidden/>
               </w:rPr>
-              <w:instrText xml:space="preserve"> PAGEREF _Toc226533068 \h </w:instrText>
+              <w:instrText xml:space="preserve"> PAGEREF _Toc226552627 \h </w:instrText>
             </w:r>
             <w:r>
               <w:rPr>
@@ -3211,7 +3211,7 @@
                 <w:noProof/>
                 <w:webHidden/>
               </w:rPr>
-              <w:t>21</w:t>
+              <w:t>22</w:t>
             </w:r>
             <w:r>
               <w:rPr>
@@ -3238,7 +3238,7 @@
               <w:lang w:val="en-CH" w:eastAsia="en-GB"/>
             </w:rPr>
           </w:pPr>
-          <w:hyperlink w:anchor="_Toc226533069" w:history="1">
+          <w:hyperlink w:anchor="_Toc226552628" w:history="1">
             <w:r>
               <w:rPr>
                 <w:rStyle w:val="Hyperlink"/>
@@ -3265,7 +3265,7 @@
                 <w:noProof/>
                 <w:webHidden/>
               </w:rPr>
-              <w:instrText xml:space="preserve"> PAGEREF _Toc226533069 \h </w:instrText>
+              <w:instrText xml:space="preserve"> PAGEREF _Toc226552628 \h </w:instrText>
             </w:r>
             <w:r>
               <w:rPr>
@@ -3285,7 +3285,151 @@
                 <w:noProof/>
                 <w:webHidden/>
               </w:rPr>
-              <w:t>21</w:t>
+              <w:t>22</w:t>
+            </w:r>
+            <w:r>
+              <w:rPr>
+                <w:noProof/>
+                <w:webHidden/>
+              </w:rPr>
+              <w:fldChar w:fldCharType="end"/>
+            </w:r>
+          </w:hyperlink>
+        </w:p>
+        <w:p>
+          <w:pPr>
+            <w:pStyle w:val="TOC3"/>
+            <w:tabs>
+              <w:tab w:val="right" w:leader="dot" w:pos="9016"/>
+            </w:tabs>
+            <w:rPr>
+              <w:rFonts w:eastAsiaTheme="minorEastAsia"/>
+              <w:noProof/>
+              <w:sz w:val="24"/>
+              <w:szCs w:val="24"/>
+              <w:lang w:val="en-CH" w:eastAsia="en-GB"/>
+            </w:rPr>
+          </w:pPr>
+          <w:hyperlink w:anchor="_Toc226552629" w:history="1">
+            <w:r>
+              <w:rPr>
+                <w:rStyle w:val="Hyperlink"/>
+                <w:noProof/>
+              </w:rPr>
+              <w:t>7.1.1 Wichtige Tools</w:t>
+            </w:r>
+            <w:r>
+              <w:rPr>
+                <w:noProof/>
+                <w:webHidden/>
+              </w:rPr>
+              <w:tab/>
+            </w:r>
+            <w:r>
+              <w:rPr>
+                <w:noProof/>
+                <w:webHidden/>
+              </w:rPr>
+              <w:fldChar w:fldCharType="begin"/>
+            </w:r>
+            <w:r>
+              <w:rPr>
+                <w:noProof/>
+                <w:webHidden/>
+              </w:rPr>
+              <w:instrText xml:space="preserve"> PAGEREF _Toc226552629 \h </w:instrText>
+            </w:r>
+            <w:r>
+              <w:rPr>
+                <w:noProof/>
+                <w:webHidden/>
+              </w:rPr>
+            </w:r>
+            <w:r>
+              <w:rPr>
+                <w:noProof/>
+                <w:webHidden/>
+              </w:rPr>
+              <w:fldChar w:fldCharType="separate"/>
+            </w:r>
+            <w:r>
+              <w:rPr>
+                <w:noProof/>
+                <w:webHidden/>
+              </w:rPr>
+              <w:t>22</w:t>
+            </w:r>
+            <w:r>
+              <w:rPr>
+                <w:noProof/>
+                <w:webHidden/>
+              </w:rPr>
+              <w:fldChar w:fldCharType="end"/>
+            </w:r>
+          </w:hyperlink>
+        </w:p>
+        <w:p>
+          <w:pPr>
+            <w:pStyle w:val="TOC3"/>
+            <w:tabs>
+              <w:tab w:val="right" w:leader="dot" w:pos="9016"/>
+            </w:tabs>
+            <w:rPr>
+              <w:rFonts w:eastAsiaTheme="minorEastAsia"/>
+              <w:noProof/>
+              <w:sz w:val="24"/>
+              <w:szCs w:val="24"/>
+              <w:lang w:val="en-CH" w:eastAsia="en-GB"/>
+            </w:rPr>
+          </w:pPr>
+          <w:hyperlink w:anchor="_Toc226552630" w:history="1">
+            <w:r>
+              <w:rPr>
+                <w:rStyle w:val="Hyperlink"/>
+                <w:noProof/>
+              </w:rPr>
+              <w:t>7.1.2 Architekturdiagramm</w:t>
+            </w:r>
+            <w:r>
+              <w:rPr>
+                <w:noProof/>
+                <w:webHidden/>
+              </w:rPr>
+              <w:tab/>
+            </w:r>
+            <w:r>
+              <w:rPr>
+                <w:noProof/>
+                <w:webHidden/>
+              </w:rPr>
+              <w:fldChar w:fldCharType="begin"/>
+            </w:r>
+            <w:r>
+              <w:rPr>
+                <w:noProof/>
+                <w:webHidden/>
+              </w:rPr>
+              <w:instrText xml:space="preserve"> PAGEREF _Toc226552630 \h </w:instrText>
+            </w:r>
+            <w:r>
+              <w:rPr>
+                <w:noProof/>
+                <w:webHidden/>
+              </w:rPr>
+            </w:r>
+            <w:r>
+              <w:rPr>
+                <w:noProof/>
+                <w:webHidden/>
+              </w:rPr>
+              <w:fldChar w:fldCharType="separate"/>
+            </w:r>
+            <w:r>
+              <w:rPr>
+                <w:noProof/>
+                <w:webHidden/>
+              </w:rPr>
+              <w:t>23</w:t>
             </w:r>
             <w:r>
               <w:rPr>
@@ -3312,7 +3456,7 @@
               <w:lang w:val="en-CH" w:eastAsia="en-GB"/>
             </w:rPr>
           </w:pPr>
-          <w:hyperlink w:anchor="_Toc226533070" w:history="1">
+          <w:hyperlink w:anchor="_Toc226552631" w:history="1">
             <w:r>
               <w:rPr>
                 <w:rStyle w:val="Hyperlink"/>
@@ -3339,7 +3483,7 @@
                 <w:noProof/>
                 <w:webHidden/>
               </w:rPr>
-              <w:instrText xml:space="preserve"> PAGEREF _Toc226533070 \h </w:instrText>
+              <w:instrText xml:space="preserve"> PAGEREF _Toc226552631 \h </w:instrText>
             </w:r>
             <w:r>
               <w:rPr>
@@ -3359,7 +3503,7 @@
                 <w:noProof/>
                 <w:webHidden/>
               </w:rPr>
-              <w:t>21</w:t>
+              <w:t>23</w:t>
             </w:r>
             <w:r>
               <w:rPr>
@@ -3386,7 +3530,7 @@
               <w:lang w:val="en-CH" w:eastAsia="en-GB"/>
             </w:rPr>
           </w:pPr>
-          <w:hyperlink w:anchor="_Toc226533071" w:history="1">
+          <w:hyperlink w:anchor="_Toc226552632" w:history="1">
             <w:r>
               <w:rPr>
                 <w:rStyle w:val="Hyperlink"/>
@@ -3413,7 +3557,7 @@
                 <w:noProof/>
                 <w:webHidden/>
               </w:rPr>
-              <w:instrText xml:space="preserve"> PAGEREF _Toc226533071 \h </w:instrText>
+              <w:instrText xml:space="preserve"> PAGEREF _Toc226552632 \h </w:instrText>
             </w:r>
             <w:r>
               <w:rPr>
@@ -3433,7 +3577,7 @@
                 <w:noProof/>
                 <w:webHidden/>
               </w:rPr>
-              <w:t>22</w:t>
+              <w:t>24</w:t>
             </w:r>
             <w:r>
               <w:rPr>
@@ -3458,7 +3602,7 @@
               <w:lang w:val="en-CH" w:eastAsia="en-GB"/>
             </w:rPr>
           </w:pPr>
-          <w:hyperlink w:anchor="_Toc226533072" w:history="1">
+          <w:hyperlink w:anchor="_Toc226552633" w:history="1">
             <w:r>
               <w:rPr>
                 <w:rStyle w:val="Hyperlink"/>
@@ -3485,7 +3629,7 @@
                 <w:noProof/>
                 <w:webHidden/>
               </w:rPr>
-              <w:instrText xml:space="preserve"> PAGEREF _Toc226533072 \h </w:instrText>
+              <w:instrText xml:space="preserve"> PAGEREF _Toc226552633 \h </w:instrText>
             </w:r>
             <w:r>
               <w:rPr>
@@ -3505,7 +3649,7 @@
                 <w:noProof/>
                 <w:webHidden/>
               </w:rPr>
-              <w:t>22</w:t>
+              <w:t>24</w:t>
             </w:r>
             <w:r>
               <w:rPr>
@@ -3530,7 +3674,7 @@
               <w:lang w:val="en-CH" w:eastAsia="en-GB"/>
             </w:rPr>
           </w:pPr>
-          <w:hyperlink w:anchor="_Toc226533073" w:history="1">
+          <w:hyperlink w:anchor="_Toc226552634" w:history="1">
             <w:r>
               <w:rPr>
                 <w:rStyle w:val="Hyperlink"/>
@@ -3557,7 +3701,7 @@
                 <w:noProof/>
                 <w:webHidden/>
               </w:rPr>
-              <w:instrText xml:space="preserve"> PAGEREF _Toc226533073 \h </w:instrText>
+              <w:instrText xml:space="preserve"> PAGEREF _Toc226552634 \h </w:instrText>
             </w:r>
             <w:r>
               <w:rPr>
@@ -3577,7 +3721,81 @@
                 <w:noProof/>
                 <w:webHidden/>
               </w:rPr>
-              <w:t>23</w:t>
+              <w:t>25</w:t>
+            </w:r>
+            <w:r>
+              <w:rPr>
+                <w:noProof/>
+                <w:webHidden/>
+              </w:rPr>
+              <w:fldChar w:fldCharType="end"/>
+            </w:r>
+          </w:hyperlink>
+        </w:p>
+        <w:p>
+          <w:pPr>
+            <w:pStyle w:val="TOC2"/>
+            <w:tabs>
+              <w:tab w:val="right" w:leader="dot" w:pos="9016"/>
+            </w:tabs>
+            <w:rPr>
+              <w:rFonts w:eastAsiaTheme="minorEastAsia"/>
+              <w:b w:val="0"/>
+              <w:bCs w:val="0"/>
+              <w:noProof/>
+              <w:sz w:val="24"/>
+              <w:szCs w:val="24"/>
+              <w:lang w:val="en-CH" w:eastAsia="en-GB"/>
+            </w:rPr>
+          </w:pPr>
+          <w:hyperlink w:anchor="_Toc226552635" w:history="1">
+            <w:r>
+              <w:rPr>
+                <w:rStyle w:val="Hyperlink"/>
+                <w:noProof/>
+              </w:rPr>
+              <w:t>7.4 UI-Planung (Wireframes)</w:t>
+            </w:r>
+            <w:r>
+              <w:rPr>
+                <w:noProof/>
+                <w:webHidden/>
+              </w:rPr>
+              <w:tab/>
+            </w:r>
+            <w:r>
+              <w:rPr>
+                <w:noProof/>
+                <w:webHidden/>
+              </w:rPr>
+              <w:fldChar w:fldCharType="begin"/>
+            </w:r>
+            <w:r>
+              <w:rPr>
+                <w:noProof/>
+                <w:webHidden/>
+              </w:rPr>
+              <w:instrText xml:space="preserve"> PAGEREF _Toc226552635 \h </w:instrText>
+            </w:r>
+            <w:r>
+              <w:rPr>
+                <w:noProof/>
+                <w:webHidden/>
+              </w:rPr>
+            </w:r>
+            <w:r>
+              <w:rPr>
+                <w:noProof/>
+                <w:webHidden/>
+              </w:rPr>
+              <w:fldChar w:fldCharType="separate"/>
+            </w:r>
+            <w:r>
+              <w:rPr>
+                <w:noProof/>
+                <w:webHidden/>
+              </w:rPr>
+              <w:t>26</w:t>
             </w:r>
             <w:r>
               <w:rPr>
@@ -3604,7 +3822,7 @@
               <w:lang w:val="en-CH" w:eastAsia="en-GB"/>
             </w:rPr>
           </w:pPr>
-          <w:hyperlink w:anchor="_Toc226533074" w:history="1">
+          <w:hyperlink w:anchor="_Toc226552636" w:history="1">
             <w:r>
               <w:rPr>
                 <w:rStyle w:val="Hyperlink"/>
@@ -3631,7 +3849,7 @@
                 <w:noProof/>
                 <w:webHidden/>
               </w:rPr>
-              <w:instrText xml:space="preserve"> PAGEREF _Toc226533074 \h </w:instrText>
+              <w:instrText xml:space="preserve"> PAGEREF _Toc226552636 \h </w:instrText>
             </w:r>
             <w:r>
               <w:rPr>
@@ -3651,7 +3869,7 @@
                 <w:noProof/>
                 <w:webHidden/>
               </w:rPr>
-              <w:t>24</w:t>
+              <w:t>28</w:t>
             </w:r>
             <w:r>
               <w:rPr>
@@ -3678,7 +3896,7 @@
               <w:lang w:val="en-CH" w:eastAsia="en-GB"/>
             </w:rPr>
           </w:pPr>
-          <w:hyperlink w:anchor="_Toc226533075" w:history="1">
+          <w:hyperlink w:anchor="_Toc226552637" w:history="1">
             <w:r>
               <w:rPr>
                 <w:rStyle w:val="Hyperlink"/>
@@ -3705,7 +3923,7 @@
                 <w:noProof/>
                 <w:webHidden/>
               </w:rPr>
-              <w:instrText xml:space="preserve"> PAGEREF _Toc226533075 \h </w:instrText>
+              <w:instrText xml:space="preserve"> PAGEREF _Toc226552637 \h </w:instrText>
             </w:r>
             <w:r>
               <w:rPr>
@@ -3725,7 +3943,7 @@
                 <w:noProof/>
                 <w:webHidden/>
               </w:rPr>
-              <w:t>24</w:t>
+              <w:t>28</w:t>
             </w:r>
             <w:r>
               <w:rPr>
@@ -3752,7 +3970,7 @@
               <w:lang w:val="en-CH" w:eastAsia="en-GB"/>
             </w:rPr>
           </w:pPr>
-          <w:hyperlink w:anchor="_Toc226533076" w:history="1">
+          <w:hyperlink w:anchor="_Toc226552638" w:history="1">
             <w:r>
               <w:rPr>
                 <w:rStyle w:val="Hyperlink"/>
@@ -3779,7 +3997,7 @@
                 <w:noProof/>
                 <w:webHidden/>
               </w:rPr>
-              <w:instrText xml:space="preserve"> PAGEREF _Toc226533076 \h </w:instrText>
+              <w:instrText xml:space="preserve"> PAGEREF _Toc226552638 \h </w:instrText>
             </w:r>
             <w:r>
               <w:rPr>
@@ -3799,7 +4017,7 @@
                 <w:noProof/>
                 <w:webHidden/>
               </w:rPr>
-              <w:t>24</w:t>
+              <w:t>29</w:t>
             </w:r>
             <w:r>
               <w:rPr>
@@ -3826,7 +4044,7 @@
               <w:lang w:val="en-CH" w:eastAsia="en-GB"/>
             </w:rPr>
           </w:pPr>
-          <w:hyperlink w:anchor="_Toc226533077" w:history="1">
+          <w:hyperlink w:anchor="_Toc226552639" w:history="1">
             <w:r>
               <w:rPr>
                 <w:rStyle w:val="Hyperlink"/>
@@ -3853,7 +4071,7 @@
                 <w:noProof/>
                 <w:webHidden/>
               </w:rPr>
-              <w:instrText xml:space="preserve"> PAGEREF _Toc226533077 \h </w:instrText>
+              <w:instrText xml:space="preserve"> PAGEREF _Toc226552639 \h </w:instrText>
             </w:r>
             <w:r>
               <w:rPr>
@@ -3873,7 +4091,7 @@
                 <w:noProof/>
                 <w:webHidden/>
               </w:rPr>
-              <w:t>24</w:t>
+              <w:t>29</w:t>
             </w:r>
             <w:r>
               <w:rPr>
@@ -3900,7 +4118,7 @@
               <w:lang w:val="en-CH" w:eastAsia="en-GB"/>
             </w:rPr>
           </w:pPr>
-          <w:hyperlink w:anchor="_Toc226533078" w:history="1">
+          <w:hyperlink w:anchor="_Toc226552640" w:history="1">
             <w:r>
               <w:rPr>
                 <w:rStyle w:val="Hyperlink"/>
@@ -3927,7 +4145,7 @@
                 <w:noProof/>
                 <w:webHidden/>
               </w:rPr>
-              <w:instrText xml:space="preserve"> PAGEREF _Toc226533078 \h </w:instrText>
+              <w:instrText xml:space="preserve"> PAGEREF _Toc226552640 \h </w:instrText>
             </w:r>
             <w:r>
               <w:rPr>
@@ -3947,7 +4165,7 @@
                 <w:noProof/>
                 <w:webHidden/>
               </w:rPr>
-              <w:t>24</w:t>
+              <w:t>30</w:t>
             </w:r>
             <w:r>
               <w:rPr>
@@ -3974,7 +4192,7 @@
               <w:lang w:val="en-CH" w:eastAsia="en-GB"/>
             </w:rPr>
           </w:pPr>
-          <w:hyperlink w:anchor="_Toc226533079" w:history="1">
+          <w:hyperlink w:anchor="_Toc226552641" w:history="1">
             <w:r>
               <w:rPr>
                 <w:rStyle w:val="Hyperlink"/>
@@ -4001,7 +4219,7 @@
                 <w:noProof/>
                 <w:webHidden/>
               </w:rPr>
-              <w:instrText xml:space="preserve"> PAGEREF _Toc226533079 \h </w:instrText>
+              <w:instrText xml:space="preserve"> PAGEREF _Toc226552641 \h </w:instrText>
             </w:r>
             <w:r>
               <w:rPr>
@@ -4021,7 +4239,7 @@
                 <w:noProof/>
                 <w:webHidden/>
               </w:rPr>
-              <w:t>24</w:t>
+              <w:t>31</w:t>
             </w:r>
             <w:r>
               <w:rPr>
@@ -4048,7 +4266,7 @@
               <w:lang w:val="en-CH" w:eastAsia="en-GB"/>
             </w:rPr>
           </w:pPr>
-          <w:hyperlink w:anchor="_Toc226533080" w:history="1">
+          <w:hyperlink w:anchor="_Toc226552642" w:history="1">
             <w:r>
               <w:rPr>
                 <w:rStyle w:val="Hyperlink"/>
@@ -4075,7 +4293,7 @@
                 <w:noProof/>
                 <w:webHidden/>
               </w:rPr>
-              <w:instrText xml:space="preserve"> PAGEREF _Toc226533080 \h </w:instrText>
+              <w:instrText xml:space="preserve"> PAGEREF _Toc226552642 \h </w:instrText>
             </w:r>
             <w:r>
               <w:rPr>
@@ -4095,7 +4313,7 @@
                 <w:noProof/>
                 <w:webHidden/>
               </w:rPr>
-              <w:t>24</w:t>
+              <w:t>31</w:t>
             </w:r>
             <w:r>
               <w:rPr>
@@ -4120,7 +4338,7 @@
               <w:lang w:val="en-CH" w:eastAsia="en-GB"/>
             </w:rPr>
           </w:pPr>
-          <w:hyperlink w:anchor="_Toc226533081" w:history="1">
+          <w:hyperlink w:anchor="_Toc226552643" w:history="1">
             <w:r>
               <w:rPr>
                 <w:rStyle w:val="Hyperlink"/>
@@ -4147,7 +4365,7 @@
                 <w:noProof/>
                 <w:webHidden/>
               </w:rPr>
-              <w:instrText xml:space="preserve"> PAGEREF _Toc226533081 \h </w:instrText>
+              <w:instrText xml:space="preserve"> PAGEREF _Toc226552643 \h </w:instrText>
             </w:r>
             <w:r>
               <w:rPr>
@@ -4167,7 +4385,7 @@
                 <w:noProof/>
                 <w:webHidden/>
               </w:rPr>
-              <w:t>24</w:t>
+              <w:t>31</w:t>
             </w:r>
             <w:r>
               <w:rPr>
@@ -4192,7 +4410,7 @@
               <w:lang w:val="en-CH" w:eastAsia="en-GB"/>
             </w:rPr>
           </w:pPr>
-          <w:hyperlink w:anchor="_Toc226533082" w:history="1">
+          <w:hyperlink w:anchor="_Toc226552644" w:history="1">
             <w:r>
               <w:rPr>
                 <w:rStyle w:val="Hyperlink"/>
@@ -4219,7 +4437,7 @@
                 <w:noProof/>
                 <w:webHidden/>
               </w:rPr>
-              <w:instrText xml:space="preserve"> PAGEREF _Toc226533082 \h </w:instrText>
+              <w:instrText xml:space="preserve"> PAGEREF _Toc226552644 \h </w:instrText>
             </w:r>
             <w:r>
               <w:rPr>
@@ -4239,7 +4457,7 @@
                 <w:noProof/>
                 <w:webHidden/>
               </w:rPr>
-              <w:t>24</w:t>
+              <w:t>31</w:t>
             </w:r>
             <w:r>
               <w:rPr>
@@ -4264,7 +4482,7 @@
               <w:lang w:val="en-CH" w:eastAsia="en-GB"/>
             </w:rPr>
           </w:pPr>
-          <w:hyperlink w:anchor="_Toc226533083" w:history="1">
+          <w:hyperlink w:anchor="_Toc226552645" w:history="1">
             <w:r>
               <w:rPr>
                 <w:rStyle w:val="Hyperlink"/>
@@ -4291,7 +4509,7 @@
                 <w:noProof/>
                 <w:webHidden/>
               </w:rPr>
-              <w:instrText xml:space="preserve"> PAGEREF _Toc226533083 \h </w:instrText>
+              <w:instrText xml:space="preserve"> PAGEREF _Toc226552645 \h </w:instrText>
             </w:r>
             <w:r>
               <w:rPr>
@@ -4311,7 +4529,7 @@
                 <w:noProof/>
                 <w:webHidden/>
               </w:rPr>
-              <w:t>24</w:t>
+              <w:t>31</w:t>
             </w:r>
             <w:r>
               <w:rPr>
@@ -4338,7 +4556,7 @@
               <w:lang w:val="en-CH" w:eastAsia="en-GB"/>
             </w:rPr>
           </w:pPr>
-          <w:hyperlink w:anchor="_Toc226533084" w:history="1">
+          <w:hyperlink w:anchor="_Toc226552646" w:history="1">
             <w:r>
               <w:rPr>
                 <w:rStyle w:val="Hyperlink"/>
@@ -4365,7 +4583,7 @@
                 <w:noProof/>
                 <w:webHidden/>
               </w:rPr>
-              <w:instrText xml:space="preserve"> PAGEREF _Toc226533084 \h </w:instrText>
+              <w:instrText xml:space="preserve"> PAGEREF _Toc226552646 \h </w:instrText>
             </w:r>
             <w:r>
               <w:rPr>
@@ -4385,7 +4603,7 @@
                 <w:noProof/>
                 <w:webHidden/>
               </w:rPr>
-              <w:t>24</w:t>
+              <w:t>31</w:t>
             </w:r>
             <w:r>
               <w:rPr>
@@ -4412,7 +4630,7 @@
               <w:lang w:val="en-CH" w:eastAsia="en-GB"/>
             </w:rPr>
           </w:pPr>
-          <w:hyperlink w:anchor="_Toc226533085" w:history="1">
+          <w:hyperlink w:anchor="_Toc226552647" w:history="1">
             <w:r>
               <w:rPr>
                 <w:rStyle w:val="Hyperlink"/>
@@ -4439,7 +4657,7 @@
                 <w:noProof/>
                 <w:webHidden/>
               </w:rPr>
-              <w:instrText xml:space="preserve"> PAGEREF _Toc226533085 \h </w:instrText>
+              <w:instrText xml:space="preserve"> PAGEREF _Toc226552647 \h </w:instrText>
             </w:r>
             <w:r>
               <w:rPr>
@@ -4459,7 +4677,7 @@
                 <w:noProof/>
                 <w:webHidden/>
               </w:rPr>
-              <w:t>24</w:t>
+              <w:t>31</w:t>
             </w:r>
             <w:r>
               <w:rPr>
@@ -4486,7 +4704,7 @@
               <w:lang w:val="en-CH" w:eastAsia="en-GB"/>
             </w:rPr>
           </w:pPr>
-          <w:hyperlink w:anchor="_Toc226533086" w:history="1">
+          <w:hyperlink w:anchor="_Toc226552648" w:history="1">
             <w:r>
               <w:rPr>
                 <w:rStyle w:val="Hyperlink"/>
@@ -4513,7 +4731,7 @@
                 <w:noProof/>
                 <w:webHidden/>
               </w:rPr>
-              <w:instrText xml:space="preserve"> PAGEREF _Toc226533086 \h </w:instrText>
+              <w:instrText xml:space="preserve"> PAGEREF _Toc226552648 \h </w:instrText>
             </w:r>
             <w:r>
               <w:rPr>
@@ -4533,7 +4751,7 @@
                 <w:noProof/>
                 <w:webHidden/>
               </w:rPr>
-              <w:t>24</w:t>
+              <w:t>31</w:t>
             </w:r>
             <w:r>
               <w:rPr>
@@ -4560,7 +4778,7 @@
               <w:lang w:val="en-CH" w:eastAsia="en-GB"/>
             </w:rPr>
           </w:pPr>
-          <w:hyperlink w:anchor="_Toc226533087" w:history="1">
+          <w:hyperlink w:anchor="_Toc226552649" w:history="1">
             <w:r>
               <w:rPr>
                 <w:rStyle w:val="Hyperlink"/>
@@ -4587,7 +4805,7 @@
                 <w:noProof/>
                 <w:webHidden/>
               </w:rPr>
-              <w:instrText xml:space="preserve"> PAGEREF _Toc226533087 \h </w:instrText>
+              <w:instrText xml:space="preserve"> PAGEREF _Toc226552649 \h </w:instrText>
             </w:r>
             <w:r>
               <w:rPr>
@@ -4607,7 +4825,7 @@
                 <w:noProof/>
                 <w:webHidden/>
               </w:rPr>
-              <w:t>24</w:t>
+              <w:t>31</w:t>
             </w:r>
             <w:r>
               <w:rPr>
@@ -4632,7 +4850,7 @@
               <w:lang w:val="en-CH" w:eastAsia="en-GB"/>
             </w:rPr>
           </w:pPr>
-          <w:hyperlink w:anchor="_Toc226533088" w:history="1">
+          <w:hyperlink w:anchor="_Toc226552650" w:history="1">
             <w:r>
               <w:rPr>
                 <w:rStyle w:val="Hyperlink"/>
@@ -4659,7 +4877,7 @@
                 <w:noProof/>
                 <w:webHidden/>
               </w:rPr>
-              <w:instrText xml:space="preserve"> PAGEREF _Toc226533088 \h </w:instrText>
+              <w:instrText xml:space="preserve"> PAGEREF _Toc226552650 \h </w:instrText>
             </w:r>
             <w:r>
               <w:rPr>
@@ -4679,7 +4897,7 @@
                 <w:noProof/>
                 <w:webHidden/>
               </w:rPr>
-              <w:t>24</w:t>
+              <w:t>31</w:t>
             </w:r>
             <w:r>
               <w:rPr>
@@ -4706,7 +4924,7 @@
               <w:lang w:val="en-CH" w:eastAsia="en-GB"/>
             </w:rPr>
           </w:pPr>
-          <w:hyperlink w:anchor="_Toc226533089" w:history="1">
+          <w:hyperlink w:anchor="_Toc226552651" w:history="1">
             <w:r>
               <w:rPr>
                 <w:rStyle w:val="Hyperlink"/>
@@ -4733,7 +4951,7 @@
                 <w:noProof/>
                 <w:webHidden/>
               </w:rPr>
-              <w:instrText xml:space="preserve"> PAGEREF _Toc226533089 \h </w:instrText>
+              <w:instrText xml:space="preserve"> PAGEREF _Toc226552651 \h </w:instrText>
             </w:r>
             <w:r>
               <w:rPr>
@@ -4753,7 +4971,7 @@
                 <w:noProof/>
                 <w:webHidden/>
               </w:rPr>
-              <w:t>24</w:t>
+              <w:t>31</w:t>
             </w:r>
             <w:r>
               <w:rPr>
@@ -4778,7 +4996,7 @@
               <w:lang w:val="en-CH" w:eastAsia="en-GB"/>
             </w:rPr>
           </w:pPr>
-          <w:hyperlink w:anchor="_Toc226533090" w:history="1">
+          <w:hyperlink w:anchor="_Toc226552652" w:history="1">
             <w:r>
               <w:rPr>
                 <w:rStyle w:val="Hyperlink"/>
@@ -4805,7 +5023,7 @@
                 <w:noProof/>
                 <w:webHidden/>
               </w:rPr>
-              <w:instrText xml:space="preserve"> PAGEREF _Toc226533090 \h </w:instrText>
+              <w:instrText xml:space="preserve"> PAGEREF _Toc226552652 \h </w:instrText>
             </w:r>
             <w:r>
               <w:rPr>
@@ -4825,7 +5043,7 @@
                 <w:noProof/>
                 <w:webHidden/>
               </w:rPr>
-              <w:t>24</w:t>
+              <w:t>31</w:t>
             </w:r>
             <w:r>
               <w:rPr>
@@ -4852,7 +5070,7 @@
               <w:lang w:val="en-CH" w:eastAsia="en-GB"/>
             </w:rPr>
           </w:pPr>
-          <w:hyperlink w:anchor="_Toc226533091" w:history="1">
+          <w:hyperlink w:anchor="_Toc226552653" w:history="1">
             <w:r>
               <w:rPr>
                 <w:rStyle w:val="Hyperlink"/>
@@ -4879,7 +5097,7 @@
                 <w:noProof/>
                 <w:webHidden/>
               </w:rPr>
-              <w:instrText xml:space="preserve"> PAGEREF _Toc226533091 \h </w:instrText>
+              <w:instrText xml:space="preserve"> PAGEREF _Toc226552653 \h </w:instrText>
             </w:r>
             <w:r>
               <w:rPr>
@@ -4899,7 +5117,7 @@
                 <w:noProof/>
                 <w:webHidden/>
               </w:rPr>
-              <w:t>24</w:t>
+              <w:t>31</w:t>
             </w:r>
             <w:r>
               <w:rPr>
@@ -4924,7 +5142,7 @@
               <w:lang w:val="en-CH" w:eastAsia="en-GB"/>
             </w:rPr>
           </w:pPr>
-          <w:hyperlink w:anchor="_Toc226533092" w:history="1">
+          <w:hyperlink w:anchor="_Toc226552654" w:history="1">
             <w:r>
               <w:rPr>
                 <w:rStyle w:val="Hyperlink"/>
@@ -4951,7 +5169,7 @@
                 <w:noProof/>
                 <w:webHidden/>
               </w:rPr>
-              <w:instrText xml:space="preserve"> PAGEREF _Toc226533092 \h </w:instrText>
+              <w:instrText xml:space="preserve"> PAGEREF _Toc226552654 \h </w:instrText>
             </w:r>
             <w:r>
               <w:rPr>
@@ -4971,7 +5189,7 @@
                 <w:noProof/>
                 <w:webHidden/>
               </w:rPr>
-              <w:t>24</w:t>
+              <w:t>31</w:t>
             </w:r>
             <w:r>
               <w:rPr>
@@ -4996,7 +5214,7 @@
               <w:lang w:val="en-CH" w:eastAsia="en-GB"/>
             </w:rPr>
           </w:pPr>
-          <w:hyperlink w:anchor="_Toc226533093" w:history="1">
+          <w:hyperlink w:anchor="_Toc226552655" w:history="1">
             <w:r>
               <w:rPr>
                 <w:rStyle w:val="Hyperlink"/>
@@ -5023,7 +5241,7 @@
                 <w:noProof/>
                 <w:webHidden/>
               </w:rPr>
-              <w:instrText xml:space="preserve"> PAGEREF _Toc226533093 \h </w:instrText>
+              <w:instrText xml:space="preserve"> PAGEREF _Toc226552655 \h </w:instrText>
             </w:r>
             <w:r>
               <w:rPr>
@@ -5043,7 +5261,7 @@
                 <w:noProof/>
                 <w:webHidden/>
               </w:rPr>
-              <w:t>24</w:t>
+              <w:t>31</w:t>
             </w:r>
             <w:r>
               <w:rPr>
@@ -5068,7 +5286,7 @@
               <w:lang w:val="en-CH" w:eastAsia="en-GB"/>
             </w:rPr>
           </w:pPr>
-          <w:hyperlink w:anchor="_Toc226533094" w:history="1">
+          <w:hyperlink w:anchor="_Toc226552656" w:history="1">
             <w:r>
               <w:rPr>
                 <w:rStyle w:val="Hyperlink"/>
@@ -5095,7 +5313,7 @@
                 <w:noProof/>
                 <w:webHidden/>
               </w:rPr>
-              <w:instrText xml:space="preserve"> PAGEREF _Toc226533094 \h </w:instrText>
+              <w:instrText xml:space="preserve"> PAGEREF _Toc226552656 \h </w:instrText>
             </w:r>
             <w:r>
               <w:rPr>
@@ -5115,7 +5333,7 @@
                 <w:noProof/>
                 <w:webHidden/>
               </w:rPr>
-              <w:t>25</w:t>
+              <w:t>31</w:t>
             </w:r>
             <w:r>
               <w:rPr>
@@ -5142,7 +5360,7 @@
               <w:lang w:val="en-CH" w:eastAsia="en-GB"/>
             </w:rPr>
           </w:pPr>
-          <w:hyperlink w:anchor="_Toc226533095" w:history="1">
+          <w:hyperlink w:anchor="_Toc226552657" w:history="1">
             <w:r>
               <w:rPr>
                 <w:rStyle w:val="Hyperlink"/>
@@ -5169,7 +5387,7 @@
                 <w:noProof/>
                 <w:webHidden/>
               </w:rPr>
-              <w:instrText xml:space="preserve"> PAGEREF _Toc226533095 \h </w:instrText>
+              <w:instrText xml:space="preserve"> PAGEREF _Toc226552657 \h </w:instrText>
             </w:r>
             <w:r>
               <w:rPr>
@@ -5189,7 +5407,7 @@
                 <w:noProof/>
                 <w:webHidden/>
               </w:rPr>
-              <w:t>25</w:t>
+              <w:t>32</w:t>
             </w:r>
             <w:r>
               <w:rPr>
@@ -5214,7 +5432,7 @@
               <w:lang w:val="en-CH" w:eastAsia="en-GB"/>
             </w:rPr>
           </w:pPr>
-          <w:hyperlink w:anchor="_Toc226533096" w:history="1">
+          <w:hyperlink w:anchor="_Toc226552658" w:history="1">
             <w:r>
               <w:rPr>
                 <w:rStyle w:val="Hyperlink"/>
@@ -5241,7 +5459,7 @@
                 <w:noProof/>
                 <w:webHidden/>
               </w:rPr>
-              <w:instrText xml:space="preserve"> PAGEREF _Toc226533096 \h </w:instrText>
+              <w:instrText xml:space="preserve"> PAGEREF _Toc226552658 \h </w:instrText>
             </w:r>
             <w:r>
               <w:rPr>
@@ -5261,7 +5479,7 @@
                 <w:noProof/>
                 <w:webHidden/>
               </w:rPr>
-              <w:t>25</w:t>
+              <w:t>32</w:t>
             </w:r>
             <w:r>
               <w:rPr>
@@ -5286,7 +5504,7 @@
               <w:lang w:val="en-CH" w:eastAsia="en-GB"/>
             </w:rPr>
           </w:pPr>
-          <w:hyperlink w:anchor="_Toc226533097" w:history="1">
+          <w:hyperlink w:anchor="_Toc226552659" w:history="1">
             <w:r>
               <w:rPr>
                 <w:rStyle w:val="Hyperlink"/>
@@ -5313,7 +5531,7 @@
                 <w:noProof/>
                 <w:webHidden/>
               </w:rPr>
-              <w:instrText xml:space="preserve"> PAGEREF _Toc226533097 \h </w:instrText>
+              <w:instrText xml:space="preserve"> PAGEREF _Toc226552659 \h </w:instrText>
             </w:r>
             <w:r>
               <w:rPr>
@@ -5333,7 +5551,7 @@
                 <w:noProof/>
                 <w:webHidden/>
               </w:rPr>
-              <w:t>25</w:t>
+              <w:t>32</w:t>
             </w:r>
             <w:r>
               <w:rPr>
@@ -5358,7 +5576,7 @@
               <w:lang w:val="en-CH" w:eastAsia="en-GB"/>
             </w:rPr>
           </w:pPr>
-          <w:hyperlink w:anchor="_Toc226533098" w:history="1">
+          <w:hyperlink w:anchor="_Toc226552660" w:history="1">
             <w:r>
               <w:rPr>
                 <w:rStyle w:val="Hyperlink"/>
@@ -5385,7 +5603,7 @@
                 <w:noProof/>
                 <w:webHidden/>
               </w:rPr>
-              <w:instrText xml:space="preserve"> PAGEREF _Toc226533098 \h </w:instrText>
+              <w:instrText xml:space="preserve"> PAGEREF _Toc226552660 \h </w:instrText>
             </w:r>
             <w:r>
               <w:rPr>
@@ -5405,7 +5623,7 @@
                 <w:noProof/>
                 <w:webHidden/>
               </w:rPr>
-              <w:t>25</w:t>
+              <w:t>32</w:t>
             </w:r>
             <w:r>
               <w:rPr>
@@ -5430,7 +5648,7 @@
               <w:lang w:val="en-CH" w:eastAsia="en-GB"/>
             </w:rPr>
           </w:pPr>
-          <w:hyperlink w:anchor="_Toc226533099" w:history="1">
+          <w:hyperlink w:anchor="_Toc226552661" w:history="1">
             <w:r>
               <w:rPr>
                 <w:rStyle w:val="Hyperlink"/>
@@ -5457,7 +5675,7 @@
                 <w:noProof/>
                 <w:webHidden/>
               </w:rPr>
-              <w:instrText xml:space="preserve"> PAGEREF _Toc226533099 \h </w:instrText>
+              <w:instrText xml:space="preserve"> PAGEREF _Toc226552661 \h </w:instrText>
             </w:r>
             <w:r>
               <w:rPr>
@@ -5477,7 +5695,7 @@
                 <w:noProof/>
                 <w:webHidden/>
               </w:rPr>
-              <w:t>25</w:t>
+              <w:t>32</w:t>
             </w:r>
             <w:r>
               <w:rPr>
@@ -5502,7 +5720,7 @@
               <w:lang w:val="en-CH" w:eastAsia="en-GB"/>
             </w:rPr>
           </w:pPr>
-          <w:hyperlink w:anchor="_Toc226533100" w:history="1">
+          <w:hyperlink w:anchor="_Toc226552662" w:history="1">
             <w:r>
               <w:rPr>
                 <w:rStyle w:val="Hyperlink"/>
@@ -5529,7 +5747,7 @@
                 <w:noProof/>
                 <w:webHidden/>
               </w:rPr>
-              <w:instrText xml:space="preserve"> PAGEREF _Toc226533100 \h </w:instrText>
+              <w:instrText xml:space="preserve"> PAGEREF _Toc226552662 \h </w:instrText>
             </w:r>
             <w:r>
               <w:rPr>
@@ -5549,7 +5767,7 @@
                 <w:noProof/>
                 <w:webHidden/>
               </w:rPr>
-              <w:t>25</w:t>
+              <w:t>32</w:t>
             </w:r>
             <w:r>
               <w:rPr>
@@ -5576,7 +5794,7 @@
               <w:lang w:val="en-CH" w:eastAsia="en-GB"/>
             </w:rPr>
           </w:pPr>
-          <w:hyperlink w:anchor="_Toc226533101" w:history="1">
+          <w:hyperlink w:anchor="_Toc226552663" w:history="1">
             <w:r>
               <w:rPr>
                 <w:rStyle w:val="Hyperlink"/>
@@ -5603,7 +5821,7 @@
                 <w:noProof/>
                 <w:webHidden/>
               </w:rPr>
-              <w:instrText xml:space="preserve"> PAGEREF _Toc226533101 \h </w:instrText>
+              <w:instrText xml:space="preserve"> PAGEREF _Toc226552663 \h </w:instrText>
             </w:r>
             <w:r>
               <w:rPr>
@@ -5623,7 +5841,7 @@
                 <w:noProof/>
                 <w:webHidden/>
               </w:rPr>
-              <w:t>25</w:t>
+              <w:t>32</w:t>
             </w:r>
             <w:r>
               <w:rPr>
@@ -5650,7 +5868,7 @@
               <w:lang w:val="en-CH" w:eastAsia="en-GB"/>
             </w:rPr>
           </w:pPr>
-          <w:hyperlink w:anchor="_Toc226533102" w:history="1">
+          <w:hyperlink w:anchor="_Toc226552664" w:history="1">
             <w:r>
               <w:rPr>
                 <w:rStyle w:val="Hyperlink"/>
@@ -5677,7 +5895,7 @@
                 <w:noProof/>
                 <w:webHidden/>
               </w:rPr>
-              <w:instrText xml:space="preserve"> PAGEREF _Toc226533102 \h </w:instrText>
+              <w:instrText xml:space="preserve"> PAGEREF _Toc226552664 \h </w:instrText>
             </w:r>
             <w:r>
               <w:rPr>
@@ -5697,7 +5915,7 @@
                 <w:noProof/>
                 <w:webHidden/>
               </w:rPr>
-              <w:t>25</w:t>
+              <w:t>32</w:t>
             </w:r>
             <w:r>
               <w:rPr>
@@ -5724,7 +5942,7 @@
               <w:lang w:val="en-CH" w:eastAsia="en-GB"/>
             </w:rPr>
           </w:pPr>
-          <w:hyperlink w:anchor="_Toc226533103" w:history="1">
+          <w:hyperlink w:anchor="_Toc226552665" w:history="1">
             <w:r>
               <w:rPr>
                 <w:rStyle w:val="Hyperlink"/>
@@ -5751,7 +5969,7 @@
                 <w:noProof/>
                 <w:webHidden/>
               </w:rPr>
-              <w:instrText xml:space="preserve"> PAGEREF _Toc226533103 \h </w:instrText>
+              <w:instrText xml:space="preserve"> PAGEREF _Toc226552665 \h </w:instrText>
             </w:r>
             <w:r>
               <w:rPr>
@@ -5771,7 +5989,7 @@
                 <w:noProof/>
                 <w:webHidden/>
               </w:rPr>
-              <w:t>25</w:t>
+              <w:t>32</w:t>
             </w:r>
             <w:r>
               <w:rPr>
@@ -5798,7 +6016,7 @@
               <w:lang w:val="en-CH" w:eastAsia="en-GB"/>
             </w:rPr>
           </w:pPr>
-          <w:hyperlink w:anchor="_Toc226533104" w:history="1">
+          <w:hyperlink w:anchor="_Toc226552666" w:history="1">
             <w:r>
               <w:rPr>
                 <w:rStyle w:val="Hyperlink"/>
@@ -5825,7 +6043,7 @@
                 <w:noProof/>
                 <w:webHidden/>
               </w:rPr>
-              <w:instrText xml:space="preserve"> PAGEREF _Toc226533104 \h </w:instrText>
+              <w:instrText xml:space="preserve"> PAGEREF _Toc226552666 \h </w:instrText>
             </w:r>
             <w:r>
               <w:rPr>
@@ -5845,7 +6063,7 @@
                 <w:noProof/>
                 <w:webHidden/>
               </w:rPr>
-              <w:t>25</w:t>
+              <w:t>32</w:t>
             </w:r>
             <w:r>
               <w:rPr>
@@ -5872,7 +6090,7 @@
               <w:lang w:val="en-CH" w:eastAsia="en-GB"/>
             </w:rPr>
           </w:pPr>
-          <w:hyperlink w:anchor="_Toc226533105" w:history="1">
+          <w:hyperlink w:anchor="_Toc226552667" w:history="1">
             <w:r>
               <w:rPr>
                 <w:rStyle w:val="Hyperlink"/>
@@ -5899,7 +6117,7 @@
                 <w:noProof/>
                 <w:webHidden/>
               </w:rPr>
-              <w:instrText xml:space="preserve"> PAGEREF _Toc226533105 \h </w:instrText>
+              <w:instrText xml:space="preserve"> PAGEREF _Toc226552667 \h </w:instrText>
             </w:r>
             <w:r>
               <w:rPr>
@@ -5919,7 +6137,7 @@
                 <w:noProof/>
                 <w:webHidden/>
               </w:rPr>
-              <w:t>25</w:t>
+              <w:t>32</w:t>
             </w:r>
             <w:r>
               <w:rPr>
@@ -5946,7 +6164,7 @@
               <w:lang w:val="en-CH" w:eastAsia="en-GB"/>
             </w:rPr>
           </w:pPr>
-          <w:hyperlink w:anchor="_Toc226533106" w:history="1">
+          <w:hyperlink w:anchor="_Toc226552668" w:history="1">
             <w:r>
               <w:rPr>
                 <w:rStyle w:val="Hyperlink"/>
@@ -5973,7 +6191,7 @@
                 <w:noProof/>
                 <w:webHidden/>
               </w:rPr>
-              <w:instrText xml:space="preserve"> PAGEREF _Toc226533106 \h </w:instrText>
+              <w:instrText xml:space="preserve"> PAGEREF _Toc226552668 \h </w:instrText>
             </w:r>
             <w:r>
               <w:rPr>
@@ -5993,7 +6211,7 @@
                 <w:noProof/>
                 <w:webHidden/>
               </w:rPr>
-              <w:t>25</w:t>
+              <w:t>32</w:t>
             </w:r>
             <w:r>
               <w:rPr>
@@ -6020,7 +6238,7 @@
               <w:lang w:val="en-CH" w:eastAsia="en-GB"/>
             </w:rPr>
           </w:pPr>
-          <w:hyperlink w:anchor="_Toc226533107" w:history="1">
+          <w:hyperlink w:anchor="_Toc226552669" w:history="1">
             <w:r>
               <w:rPr>
                 <w:rStyle w:val="Hyperlink"/>
@@ -6047,7 +6265,7 @@
                 <w:noProof/>
                 <w:webHidden/>
               </w:rPr>
-              <w:instrText xml:space="preserve"> PAGEREF _Toc226533107 \h </w:instrText>
+              <w:instrText xml:space="preserve"> PAGEREF _Toc226552669 \h </w:instrText>
             </w:r>
             <w:r>
               <w:rPr>
@@ -6067,7 +6285,7 @@
                 <w:noProof/>
                 <w:webHidden/>
               </w:rPr>
-              <w:t>25</w:t>
+              <w:t>32</w:t>
             </w:r>
             <w:r>
               <w:rPr>
@@ -6094,7 +6312,7 @@
               <w:lang w:val="en-CH" w:eastAsia="en-GB"/>
             </w:rPr>
           </w:pPr>
-          <w:hyperlink w:anchor="_Toc226533108" w:history="1">
+          <w:hyperlink w:anchor="_Toc226552670" w:history="1">
             <w:r>
               <w:rPr>
                 <w:rStyle w:val="Hyperlink"/>
@@ -6121,7 +6339,7 @@
                 <w:noProof/>
                 <w:webHidden/>
               </w:rPr>
-              <w:instrText xml:space="preserve"> PAGEREF _Toc226533108 \h </w:instrText>
+              <w:instrText xml:space="preserve"> PAGEREF _Toc226552670 \h </w:instrText>
             </w:r>
             <w:r>
               <w:rPr>
@@ -6141,7 +6359,7 @@
                 <w:noProof/>
                 <w:webHidden/>
               </w:rPr>
-              <w:t>25</w:t>
+              <w:t>32</w:t>
             </w:r>
             <w:r>
               <w:rPr>
@@ -6168,7 +6386,7 @@
               <w:lang w:val="en-CH" w:eastAsia="en-GB"/>
             </w:rPr>
           </w:pPr>
-          <w:hyperlink w:anchor="_Toc226533109" w:history="1">
+          <w:hyperlink w:anchor="_Toc226552671" w:history="1">
             <w:r>
               <w:rPr>
                 <w:rStyle w:val="Hyperlink"/>
@@ -6195,7 +6413,7 @@
                 <w:noProof/>
                 <w:webHidden/>
               </w:rPr>
-              <w:instrText xml:space="preserve"> PAGEREF _Toc226533109 \h </w:instrText>
+              <w:instrText xml:space="preserve"> PAGEREF _Toc226552671 \h </w:instrText>
             </w:r>
             <w:r>
               <w:rPr>
@@ -6215,7 +6433,7 @@
                 <w:noProof/>
                 <w:webHidden/>
               </w:rPr>
-              <w:t>25</w:t>
+              <w:t>32</w:t>
             </w:r>
             <w:r>
               <w:rPr>
@@ -6242,7 +6460,7 @@
               <w:lang w:val="en-CH" w:eastAsia="en-GB"/>
             </w:rPr>
           </w:pPr>
-          <w:hyperlink w:anchor="_Toc226533110" w:history="1">
+          <w:hyperlink w:anchor="_Toc226552672" w:history="1">
             <w:r>
               <w:rPr>
                 <w:rStyle w:val="Hyperlink"/>
@@ -6269,7 +6487,7 @@
                 <w:noProof/>
                 <w:webHidden/>
               </w:rPr>
-              <w:instrText xml:space="preserve"> PAGEREF _Toc226533110 \h </w:instrText>
+              <w:instrText xml:space="preserve"> PAGEREF _Toc226552672 \h </w:instrText>
             </w:r>
             <w:r>
               <w:rPr>
@@ -6289,7 +6507,7 @@
                 <w:noProof/>
                 <w:webHidden/>
               </w:rPr>
-              <w:t>25</w:t>
+              <w:t>32</w:t>
             </w:r>
             <w:r>
               <w:rPr>
@@ -6316,7 +6534,7 @@
               <w:lang w:val="en-CH" w:eastAsia="en-GB"/>
             </w:rPr>
           </w:pPr>
-          <w:hyperlink w:anchor="_Toc226533111" w:history="1">
+          <w:hyperlink w:anchor="_Toc226552673" w:history="1">
             <w:r>
               <w:rPr>
                 <w:rStyle w:val="Hyperlink"/>
@@ -6343,7 +6561,7 @@
                 <w:noProof/>
                 <w:webHidden/>
               </w:rPr>
-              <w:instrText xml:space="preserve"> PAGEREF _Toc226533111 \h </w:instrText>
+              <w:instrText xml:space="preserve"> PAGEREF _Toc226552673 \h </w:instrText>
             </w:r>
             <w:r>
               <w:rPr>
@@ -6363,7 +6581,7 @@
                 <w:noProof/>
                 <w:webHidden/>
               </w:rPr>
-              <w:t>25</w:t>
+              <w:t>32</w:t>
             </w:r>
             <w:r>
               <w:rPr>
@@ -6390,7 +6608,7 @@
               <w:lang w:val="en-CH" w:eastAsia="en-GB"/>
             </w:rPr>
           </w:pPr>
-          <w:hyperlink w:anchor="_Toc226533112" w:history="1">
+          <w:hyperlink w:anchor="_Toc226552674" w:history="1">
             <w:r>
               <w:rPr>
                 <w:rStyle w:val="Hyperlink"/>
@@ -6417,7 +6635,7 @@
                 <w:noProof/>
                 <w:webHidden/>
               </w:rPr>
-              <w:instrText xml:space="preserve"> PAGEREF _Toc226533112 \h </w:instrText>
+              <w:instrText xml:space="preserve"> PAGEREF _Toc226552674 \h </w:instrText>
             </w:r>
             <w:r>
               <w:rPr>
@@ -6437,7 +6655,7 @@
                 <w:noProof/>
                 <w:webHidden/>
               </w:rPr>
-              <w:t>26</w:t>
+              <w:t>33</w:t>
             </w:r>
             <w:r>
               <w:rPr>
@@ -6464,7 +6682,7 @@
               <w:lang w:val="en-CH" w:eastAsia="en-GB"/>
             </w:rPr>
           </w:pPr>
-          <w:hyperlink w:anchor="_Toc226533113" w:history="1">
+          <w:hyperlink w:anchor="_Toc226552675" w:history="1">
             <w:r>
               <w:rPr>
                 <w:rStyle w:val="Hyperlink"/>
@@ -6491,7 +6709,7 @@
                 <w:noProof/>
                 <w:webHidden/>
               </w:rPr>
-              <w:instrText xml:space="preserve"> PAGEREF _Toc226533113 \h </w:instrText>
+              <w:instrText xml:space="preserve"> PAGEREF _Toc226552675 \h </w:instrText>
             </w:r>
             <w:r>
               <w:rPr>
@@ -6511,7 +6729,7 @@
                 <w:noProof/>
                 <w:webHidden/>
               </w:rPr>
-              <w:t>26</w:t>
+              <w:t>33</w:t>
             </w:r>
             <w:r>
               <w:rPr>
@@ -6538,7 +6756,7 @@
               <w:lang w:val="en-CH" w:eastAsia="en-GB"/>
             </w:rPr>
           </w:pPr>
-          <w:hyperlink w:anchor="_Toc226533114" w:history="1">
+          <w:hyperlink w:anchor="_Toc226552676" w:history="1">
             <w:r>
               <w:rPr>
                 <w:rStyle w:val="Hyperlink"/>
@@ -6565,7 +6783,7 @@
                 <w:noProof/>
                 <w:webHidden/>
               </w:rPr>
-              <w:instrText xml:space="preserve"> PAGEREF _Toc226533114 \h </w:instrText>
+              <w:instrText xml:space="preserve"> PAGEREF _Toc226552676 \h </w:instrText>
             </w:r>
             <w:r>
               <w:rPr>
@@ -6585,7 +6803,7 @@
                 <w:noProof/>
                 <w:webHidden/>
               </w:rPr>
-              <w:t>26</w:t>
+              <w:t>33</w:t>
             </w:r>
             <w:r>
               <w:rPr>
@@ -6612,7 +6830,7 @@
               <w:lang w:val="en-CH" w:eastAsia="en-GB"/>
             </w:rPr>
           </w:pPr>
-          <w:hyperlink w:anchor="_Toc226533115" w:history="1">
+          <w:hyperlink w:anchor="_Toc226552677" w:history="1">
             <w:r>
               <w:rPr>
                 <w:rStyle w:val="Hyperlink"/>
@@ -6639,7 +6857,7 @@
                 <w:noProof/>
                 <w:webHidden/>
               </w:rPr>
-              <w:instrText xml:space="preserve"> PAGEREF _Toc226533115 \h </w:instrText>
+              <w:instrText xml:space="preserve"> PAGEREF _Toc226552677 \h </w:instrText>
             </w:r>
             <w:r>
               <w:rPr>
@@ -6659,7 +6877,7 @@
                 <w:noProof/>
                 <w:webHidden/>
               </w:rPr>
-              <w:t>26</w:t>
+              <w:t>33</w:t>
             </w:r>
             <w:r>
               <w:rPr>
@@ -6686,7 +6904,7 @@
               <w:lang w:val="en-CH" w:eastAsia="en-GB"/>
             </w:rPr>
           </w:pPr>
-          <w:hyperlink w:anchor="_Toc226533116" w:history="1">
+          <w:hyperlink w:anchor="_Toc226552678" w:history="1">
             <w:r>
               <w:rPr>
                 <w:rStyle w:val="Hyperlink"/>
@@ -6713,7 +6931,7 @@
                 <w:noProof/>
                 <w:webHidden/>
               </w:rPr>
-              <w:instrText xml:space="preserve"> PAGEREF _Toc226533116 \h </w:instrText>
+              <w:instrText xml:space="preserve"> PAGEREF _Toc226552678 \h </w:instrText>
             </w:r>
             <w:r>
               <w:rPr>
@@ -6733,7 +6951,7 @@
                 <w:noProof/>
                 <w:webHidden/>
               </w:rPr>
-              <w:t>26</w:t>
+              <w:t>33</w:t>
             </w:r>
             <w:r>
               <w:rPr>
@@ -6760,7 +6978,7 @@
               <w:lang w:val="en-CH" w:eastAsia="en-GB"/>
             </w:rPr>
           </w:pPr>
-          <w:hyperlink w:anchor="_Toc226533117" w:history="1">
+          <w:hyperlink w:anchor="_Toc226552679" w:history="1">
             <w:r>
               <w:rPr>
                 <w:rStyle w:val="Hyperlink"/>
@@ -6787,7 +7005,7 @@
                 <w:noProof/>
                 <w:webHidden/>
               </w:rPr>
-              <w:instrText xml:space="preserve"> PAGEREF _Toc226533117 \h </w:instrText>
+              <w:instrText xml:space="preserve"> PAGEREF _Toc226552679 \h </w:instrText>
             </w:r>
             <w:r>
               <w:rPr>
@@ -6807,7 +7025,7 @@
                 <w:noProof/>
                 <w:webHidden/>
               </w:rPr>
-              <w:t>26</w:t>
+              <w:t>33</w:t>
             </w:r>
             <w:r>
               <w:rPr>
@@ -6834,7 +7052,7 @@
               <w:lang w:val="en-CH" w:eastAsia="en-GB"/>
             </w:rPr>
           </w:pPr>
-          <w:hyperlink w:anchor="_Toc226533118" w:history="1">
+          <w:hyperlink w:anchor="_Toc226552680" w:history="1">
             <w:r>
               <w:rPr>
                 <w:rStyle w:val="Hyperlink"/>
@@ -6861,7 +7079,7 @@
                 <w:noProof/>
                 <w:webHidden/>
               </w:rPr>
-              <w:instrText xml:space="preserve"> PAGEREF _Toc226533118 \h </w:instrText>
+              <w:instrText xml:space="preserve"> PAGEREF _Toc226552680 \h </w:instrText>
             </w:r>
             <w:r>
               <w:rPr>
@@ -6881,7 +7099,7 @@
                 <w:noProof/>
                 <w:webHidden/>
               </w:rPr>
-              <w:t>26</w:t>
+              <w:t>33</w:t>
             </w:r>
             <w:r>
               <w:rPr>
@@ -6908,7 +7126,7 @@
               <w:lang w:val="en-CH" w:eastAsia="en-GB"/>
             </w:rPr>
           </w:pPr>
-          <w:hyperlink w:anchor="_Toc226533119" w:history="1">
+          <w:hyperlink w:anchor="_Toc226552681" w:history="1">
             <w:r>
               <w:rPr>
                 <w:rStyle w:val="Hyperlink"/>
@@ -6935,7 +7153,7 @@
                 <w:noProof/>
                 <w:webHidden/>
               </w:rPr>
-              <w:instrText xml:space="preserve"> PAGEREF _Toc226533119 \h </w:instrText>
+              <w:instrText xml:space="preserve"> PAGEREF _Toc226552681 \h </w:instrText>
             </w:r>
             <w:r>
               <w:rPr>
@@ -6955,7 +7173,7 @@
                 <w:noProof/>
                 <w:webHidden/>
               </w:rPr>
-              <w:t>26</w:t>
+              <w:t>33</w:t>
             </w:r>
             <w:r>
               <w:rPr>
@@ -6982,7 +7200,7 @@
               <w:lang w:val="en-CH" w:eastAsia="en-GB"/>
             </w:rPr>
           </w:pPr>
-          <w:hyperlink w:anchor="_Toc226533120" w:history="1">
+          <w:hyperlink w:anchor="_Toc226552682" w:history="1">
             <w:r>
               <w:rPr>
                 <w:rStyle w:val="Hyperlink"/>
@@ -7009,7 +7227,7 @@
                 <w:noProof/>
                 <w:webHidden/>
               </w:rPr>
-              <w:instrText xml:space="preserve"> PAGEREF _Toc226533120 \h </w:instrText>
+              <w:instrText xml:space="preserve"> PAGEREF _Toc226552682 \h </w:instrText>
             </w:r>
             <w:r>
               <w:rPr>
@@ -7029,7 +7247,7 @@
                 <w:noProof/>
                 <w:webHidden/>
               </w:rPr>
-              <w:t>26</w:t>
+              <w:t>33</w:t>
             </w:r>
             <w:r>
               <w:rPr>
@@ -7056,7 +7274,7 @@
               <w:lang w:val="en-CH" w:eastAsia="en-GB"/>
             </w:rPr>
           </w:pPr>
-          <w:hyperlink w:anchor="_Toc226533121" w:history="1">
+          <w:hyperlink w:anchor="_Toc226552683" w:history="1">
             <w:r>
               <w:rPr>
                 <w:rStyle w:val="Hyperlink"/>
@@ -7083,7 +7301,7 @@
                 <w:noProof/>
                 <w:webHidden/>
               </w:rPr>
-              <w:instrText xml:space="preserve"> PAGEREF _Toc226533121 \h </w:instrText>
+              <w:instrText xml:space="preserve"> PAGEREF _Toc226552683 \h </w:instrText>
             </w:r>
             <w:r>
               <w:rPr>
@@ -7103,7 +7321,7 @@
                 <w:noProof/>
                 <w:webHidden/>
               </w:rPr>
-              <w:t>26</w:t>
+              <w:t>33</w:t>
             </w:r>
             <w:r>
               <w:rPr>
@@ -7130,7 +7348,7 @@
               <w:lang w:val="en-CH" w:eastAsia="en-GB"/>
             </w:rPr>
           </w:pPr>
-          <w:hyperlink w:anchor="_Toc226533122" w:history="1">
+          <w:hyperlink w:anchor="_Toc226552684" w:history="1">
             <w:r>
               <w:rPr>
                 <w:rStyle w:val="Hyperlink"/>
@@ -7157,7 +7375,7 @@
                 <w:noProof/>
                 <w:webHidden/>
               </w:rPr>
-              <w:instrText xml:space="preserve"> PAGEREF _Toc226533122 \h </w:instrText>
+              <w:instrText xml:space="preserve"> PAGEREF _Toc226552684 \h </w:instrText>
             </w:r>
             <w:r>
               <w:rPr>
@@ -7177,7 +7395,7 @@
                 <w:noProof/>
                 <w:webHidden/>
               </w:rPr>
-              <w:t>26</w:t>
+              <w:t>33</w:t>
             </w:r>
             <w:r>
               <w:rPr>
@@ -7204,7 +7422,7 @@
               <w:lang w:val="en-CH" w:eastAsia="en-GB"/>
             </w:rPr>
           </w:pPr>
-          <w:hyperlink w:anchor="_Toc226533123" w:history="1">
+          <w:hyperlink w:anchor="_Toc226552685" w:history="1">
             <w:r>
               <w:rPr>
                 <w:rStyle w:val="Hyperlink"/>
@@ -7231,7 +7449,7 @@
                 <w:noProof/>
                 <w:webHidden/>
               </w:rPr>
-              <w:instrText xml:space="preserve"> PAGEREF _Toc226533123 \h </w:instrText>
+              <w:instrText xml:space="preserve"> PAGEREF _Toc226552685 \h </w:instrText>
             </w:r>
             <w:r>
               <w:rPr>
@@ -7251,7 +7469,7 @@
                 <w:noProof/>
                 <w:webHidden/>
               </w:rPr>
-              <w:t>26</w:t>
+              <w:t>33</w:t>
             </w:r>
             <w:r>
               <w:rPr>
@@ -7278,7 +7496,7 @@
               <w:lang w:val="en-CH" w:eastAsia="en-GB"/>
             </w:rPr>
           </w:pPr>
-          <w:hyperlink w:anchor="_Toc226533124" w:history="1">
+          <w:hyperlink w:anchor="_Toc226552686" w:history="1">
             <w:r>
               <w:rPr>
                 <w:rStyle w:val="Hyperlink"/>
@@ -7305,7 +7523,7 @@
                 <w:noProof/>
                 <w:webHidden/>
               </w:rPr>
-              <w:instrText xml:space="preserve"> PAGEREF _Toc226533124 \h </w:instrText>
+              <w:instrText xml:space="preserve"> PAGEREF _Toc226552686 \h </w:instrText>
             </w:r>
             <w:r>
               <w:rPr>
@@ -7325,7 +7543,7 @@
                 <w:noProof/>
                 <w:webHidden/>
               </w:rPr>
-              <w:t>26</w:t>
+              <w:t>33</w:t>
             </w:r>
             <w:r>
               <w:rPr>
@@ -7350,7 +7568,7 @@
               <w:lang w:val="en-CH" w:eastAsia="en-GB"/>
             </w:rPr>
           </w:pPr>
-          <w:hyperlink w:anchor="_Toc226533125" w:history="1">
+          <w:hyperlink w:anchor="_Toc226552687" w:history="1">
             <w:r>
               <w:rPr>
                 <w:rStyle w:val="Hyperlink"/>
@@ -7377,7 +7595,7 @@
                 <w:noProof/>
                 <w:webHidden/>
               </w:rPr>
-              <w:instrText xml:space="preserve"> PAGEREF _Toc226533125 \h </w:instrText>
+              <w:instrText xml:space="preserve"> PAGEREF _Toc226552687 \h </w:instrText>
             </w:r>
             <w:r>
               <w:rPr>
@@ -7397,7 +7615,7 @@
                 <w:noProof/>
                 <w:webHidden/>
               </w:rPr>
-              <w:t>26</w:t>
+              <w:t>33</w:t>
             </w:r>
             <w:r>
               <w:rPr>
@@ -7422,7 +7640,7 @@
               <w:lang w:val="en-CH" w:eastAsia="en-GB"/>
             </w:rPr>
           </w:pPr>
-          <w:hyperlink w:anchor="_Toc226533126" w:history="1">
+          <w:hyperlink w:anchor="_Toc226552688" w:history="1">
             <w:r>
               <w:rPr>
                 <w:rStyle w:val="Hyperlink"/>
@@ -7449,7 +7667,7 @@
                 <w:noProof/>
                 <w:webHidden/>
               </w:rPr>
-              <w:instrText xml:space="preserve"> PAGEREF _Toc226533126 \h </w:instrText>
+              <w:instrText xml:space="preserve"> PAGEREF _Toc226552688 \h </w:instrText>
             </w:r>
             <w:r>
               <w:rPr>
@@ -7469,7 +7687,7 @@
                 <w:noProof/>
                 <w:webHidden/>
               </w:rPr>
-              <w:t>27</w:t>
+              <w:t>34</w:t>
             </w:r>
             <w:r>
               <w:rPr>
@@ -7494,7 +7712,7 @@
               <w:lang w:val="en-CH" w:eastAsia="en-GB"/>
             </w:rPr>
           </w:pPr>
-          <w:hyperlink w:anchor="_Toc226533127" w:history="1">
+          <w:hyperlink w:anchor="_Toc226552689" w:history="1">
             <w:r>
               <w:rPr>
                 <w:rStyle w:val="Hyperlink"/>
@@ -7521,7 +7739,7 @@
                 <w:noProof/>
                 <w:webHidden/>
               </w:rPr>
-              <w:instrText xml:space="preserve"> PAGEREF _Toc226533127 \h </w:instrText>
+              <w:instrText xml:space="preserve"> PAGEREF _Toc226552689 \h </w:instrText>
             </w:r>
             <w:r>
               <w:rPr>
@@ -7541,7 +7759,7 @@
                 <w:noProof/>
                 <w:webHidden/>
               </w:rPr>
-              <w:t>27</w:t>
+              <w:t>34</w:t>
             </w:r>
             <w:r>
               <w:rPr>
@@ -7573,7 +7791,7 @@
       <w:pPr>
         <w:pStyle w:val="Heading1"/>
       </w:pPr>
-      <w:bookmarkStart w:id="0" w:name="_Toc226533039"/>
+      <w:bookmarkStart w:id="0" w:name="_Toc226552598"/>
       <w:r>
         <w:rPr>
           <w:highlight w:val="yellow"/>
@@ -7587,7 +7805,7 @@
       <w:pPr>
         <w:pStyle w:val="Heading1"/>
       </w:pPr>
-      <w:bookmarkStart w:id="1" w:name="_Toc226533040"/>
+      <w:bookmarkStart w:id="1" w:name="_Toc226552599"/>
       <w:r>
         <w:t>1. Projektaufbauorganisation</w:t>
       </w:r>
@@ -7597,7 +7815,7 @@
       <w:pPr>
         <w:pStyle w:val="Heading2"/>
       </w:pPr>
-      <w:bookmarkStart w:id="2" w:name="_Toc226533041"/>
+      <w:bookmarkStart w:id="2" w:name="_Toc226552600"/>
       <w:r>
         <w:t>1.1 Rollentabelle</w:t>
       </w:r>
@@ -8301,7 +8519,7 @@
       <w:pPr>
         <w:pStyle w:val="Heading2"/>
       </w:pPr>
-      <w:bookmarkStart w:id="5" w:name="_Toc226533042"/>
+      <w:bookmarkStart w:id="5" w:name="_Toc226552601"/>
       <w:r>
         <w:lastRenderedPageBreak/>
         <w:t xml:space="preserve">1.2 </w:t>
@@ -8394,7 +8612,7 @@
       <w:pPr>
         <w:pStyle w:val="Heading2"/>
       </w:pPr>
-      <w:bookmarkStart w:id="7" w:name="_Toc226533043"/>
+      <w:bookmarkStart w:id="7" w:name="_Toc226552602"/>
       <w:r>
         <w:t xml:space="preserve">1.3 Auftrag und </w:t>
       </w:r>
@@ -8416,7 +8634,7 @@
           <w:lang w:eastAsia="en-GB"/>
         </w:rPr>
       </w:pPr>
-      <w:bookmarkStart w:id="8" w:name="_Toc226533044"/>
+      <w:bookmarkStart w:id="8" w:name="_Toc226552603"/>
       <w:r>
         <w:rPr>
           <w:rFonts w:eastAsia="Times New Roman"/>
@@ -8510,16 +8728,8 @@
         <w:rPr>
           <w:shd w:val="clear" w:color="auto" w:fill="FFFFFF"/>
         </w:rPr>
-        <w:t xml:space="preserve">Nach der Anmeldung gelangt der Benutzer </w:t>
-      </w:r>
-      <w:proofErr w:type="gramStart"/>
-      <w:r>
-        <w:rPr>
-          <w:shd w:val="clear" w:color="auto" w:fill="FFFFFF"/>
-        </w:rPr>
-        <w:t>zur Template</w:t>
-      </w:r>
-      <w:proofErr w:type="gramEnd"/>
+        <w:t>Nach der Anmeldung gelangt der Benutzer zur Template</w:t>
+      </w:r>
       <w:r>
         <w:rPr>
           <w:shd w:val="clear" w:color="auto" w:fill="FFFFFF"/>
@@ -8892,7 +9102,7 @@
           <w:lang w:eastAsia="en-GB"/>
         </w:rPr>
       </w:pPr>
-      <w:bookmarkStart w:id="9" w:name="_Toc226533045"/>
+      <w:bookmarkStart w:id="9" w:name="_Toc226552604"/>
       <w:r>
         <w:rPr>
           <w:rFonts w:eastAsia="Times New Roman"/>
@@ -8959,16 +9169,8 @@
         <w:rPr>
           <w:shd w:val="clear" w:color="auto" w:fill="FFFFFF"/>
         </w:rPr>
-        <w:t xml:space="preserve">- Frontend mit React und TypeScript </w:t>
-      </w:r>
-      <w:proofErr w:type="gramStart"/>
-      <w:r>
-        <w:rPr>
-          <w:shd w:val="clear" w:color="auto" w:fill="FFFFFF"/>
-        </w:rPr>
-        <w:t>zur Template</w:t>
-      </w:r>
-      <w:proofErr w:type="gramEnd"/>
+        <w:t>- Frontend mit React und TypeScript zur Template</w:t>
+      </w:r>
       <w:r>
         <w:rPr>
           <w:shd w:val="clear" w:color="auto" w:fill="FFFFFF"/>
@@ -9115,7 +9317,7 @@
           <w:lang w:eastAsia="en-GB"/>
         </w:rPr>
       </w:pPr>
-      <w:bookmarkStart w:id="10" w:name="_Toc226533046"/>
+      <w:bookmarkStart w:id="10" w:name="_Toc226552605"/>
       <w:r>
         <w:rPr>
           <w:rFonts w:eastAsia="Times New Roman"/>
@@ -9169,7 +9371,7 @@
       <w:pPr>
         <w:pStyle w:val="Heading1"/>
       </w:pPr>
-      <w:bookmarkStart w:id="11" w:name="_Toc226533047"/>
+      <w:bookmarkStart w:id="11" w:name="_Toc226552606"/>
       <w:r>
         <w:lastRenderedPageBreak/>
         <w:t>2. Zeitplan</w:t>
@@ -9180,7 +9382,7 @@
       <w:pPr>
         <w:pStyle w:val="Heading2"/>
       </w:pPr>
-      <w:bookmarkStart w:id="12" w:name="_Toc226533048"/>
+      <w:bookmarkStart w:id="12" w:name="_Toc226552607"/>
       <w:r>
         <w:t>2.1 Übersicht Zeitplan</w:t>
       </w:r>
@@ -9191,7 +9393,7 @@
         <w:rPr>
           <w:highlight w:val="yellow"/>
         </w:rPr>
-        <w:t>Besseren Screenshot einfügen!!</w:t>
+        <w:t>Am Ende der IPA (Tag 9-10) fertigen Zeitplan einfügen</w:t>
       </w:r>
     </w:p>
     <w:p>
@@ -9271,7 +9473,7 @@
       <w:pPr>
         <w:pStyle w:val="Heading2"/>
       </w:pPr>
-      <w:bookmarkStart w:id="14" w:name="_Toc226533049"/>
+      <w:bookmarkStart w:id="14" w:name="_Toc226552608"/>
       <w:r>
         <w:t>2.2 Soll / Ist vergleich</w:t>
       </w:r>
@@ -9310,7 +9512,7 @@
       <w:pPr>
         <w:pStyle w:val="Heading2"/>
       </w:pPr>
-      <w:bookmarkStart w:id="15" w:name="_Toc226533050"/>
+      <w:bookmarkStart w:id="15" w:name="_Toc226552609"/>
       <w:r>
         <w:lastRenderedPageBreak/>
         <w:t>2.3 Risikomanagement</w:t>
@@ -10884,7 +11086,7 @@
       <w:pPr>
         <w:pStyle w:val="Heading1"/>
       </w:pPr>
-      <w:bookmarkStart w:id="17" w:name="_Toc226533051"/>
+      <w:bookmarkStart w:id="17" w:name="_Toc226552610"/>
       <w:r>
         <w:lastRenderedPageBreak/>
         <w:t>3. Arbeitsprotokoll (Journal)</w:t>
@@ -11377,14 +11579,14 @@
                 <w:sz w:val="18"/>
                 <w:szCs w:val="18"/>
               </w:rPr>
-              <w:t>Ich habe für die Erstellung meines Kontext Diagramm auf dieser Website Inspiration gesucht:</w:t>
-            </w:r>
-            <w:r>
-              <w:rPr>
-                <w:sz w:val="18"/>
-                <w:szCs w:val="18"/>
-              </w:rPr>
-              <w:br/>
+              <w:t>Ich habe für die Erstellung meines Kontext Diagramm auf dieser Website Inspiration gesucht</w:t>
+            </w:r>
+            <w:r>
+              <w:rPr>
+                <w:sz w:val="18"/>
+                <w:szCs w:val="18"/>
+              </w:rPr>
+              <w:t xml:space="preserve">: </w:t>
             </w:r>
             <w:hyperlink r:id="rId13" w:history="1">
               <w:r>
@@ -11800,6 +12002,14 @@
               </w:rPr>
               <w:t xml:space="preserve"> / Planen</w:t>
             </w:r>
+            <w:r>
+              <w:rPr>
+                <w:b/>
+                <w:bCs/>
+                <w:color w:val="FFFFFF"/>
+              </w:rPr>
+              <w:t xml:space="preserve"> / entscheiden</w:t>
+            </w:r>
           </w:p>
         </w:tc>
       </w:tr>
@@ -11870,6 +12080,173 @@
                 <w:szCs w:val="18"/>
               </w:rPr>
             </w:pPr>
+            <w:r>
+              <w:rPr>
+                <w:sz w:val="18"/>
+                <w:szCs w:val="18"/>
+              </w:rPr>
+              <w:t>Recherche durchgeführt</w:t>
+            </w:r>
+          </w:p>
+          <w:p>
+            <w:pPr>
+              <w:pStyle w:val="ListParagraph"/>
+              <w:numPr>
+                <w:ilvl w:val="0"/>
+                <w:numId w:val="10"/>
+              </w:numPr>
+              <w:rPr>
+                <w:sz w:val="18"/>
+                <w:szCs w:val="18"/>
+              </w:rPr>
+            </w:pPr>
+            <w:r>
+              <w:rPr>
+                <w:sz w:val="18"/>
+                <w:szCs w:val="18"/>
+              </w:rPr>
+              <w:t>Recherche Tabelle ausgefüllt</w:t>
+            </w:r>
+          </w:p>
+          <w:p>
+            <w:pPr>
+              <w:pStyle w:val="ListParagraph"/>
+              <w:numPr>
+                <w:ilvl w:val="0"/>
+                <w:numId w:val="10"/>
+              </w:numPr>
+              <w:rPr>
+                <w:sz w:val="18"/>
+                <w:szCs w:val="18"/>
+              </w:rPr>
+            </w:pPr>
+            <w:r>
+              <w:rPr>
+                <w:sz w:val="18"/>
+                <w:szCs w:val="18"/>
+              </w:rPr>
+              <w:t>IPERKA Begründung geschrieben</w:t>
+            </w:r>
+          </w:p>
+          <w:p>
+            <w:pPr>
+              <w:pStyle w:val="ListParagraph"/>
+              <w:numPr>
+                <w:ilvl w:val="0"/>
+                <w:numId w:val="10"/>
+              </w:numPr>
+              <w:rPr>
+                <w:sz w:val="18"/>
+                <w:szCs w:val="18"/>
+              </w:rPr>
+            </w:pPr>
+            <w:r>
+              <w:rPr>
+                <w:sz w:val="18"/>
+                <w:szCs w:val="18"/>
+              </w:rPr>
+              <w:t>Tool Tabelle ausgefüllt</w:t>
+            </w:r>
+          </w:p>
+          <w:p>
+            <w:pPr>
+              <w:pStyle w:val="ListParagraph"/>
+              <w:numPr>
+                <w:ilvl w:val="0"/>
+                <w:numId w:val="10"/>
+              </w:numPr>
+              <w:rPr>
+                <w:sz w:val="18"/>
+                <w:szCs w:val="18"/>
+              </w:rPr>
+            </w:pPr>
+            <w:r>
+              <w:rPr>
+                <w:sz w:val="18"/>
+                <w:szCs w:val="18"/>
+              </w:rPr>
+              <w:t>Architekturdiagramm erstellt</w:t>
+            </w:r>
+          </w:p>
+          <w:p>
+            <w:pPr>
+              <w:pStyle w:val="ListParagraph"/>
+              <w:numPr>
+                <w:ilvl w:val="0"/>
+                <w:numId w:val="10"/>
+              </w:numPr>
+              <w:rPr>
+                <w:sz w:val="18"/>
+                <w:szCs w:val="18"/>
+              </w:rPr>
+            </w:pPr>
+            <w:r>
+              <w:rPr>
+                <w:sz w:val="18"/>
+                <w:szCs w:val="18"/>
+              </w:rPr>
+              <w:t>ERD erstellt</w:t>
+            </w:r>
+          </w:p>
+          <w:p>
+            <w:pPr>
+              <w:pStyle w:val="ListParagraph"/>
+              <w:numPr>
+                <w:ilvl w:val="0"/>
+                <w:numId w:val="10"/>
+              </w:numPr>
+              <w:rPr>
+                <w:sz w:val="18"/>
+                <w:szCs w:val="18"/>
+              </w:rPr>
+            </w:pPr>
+            <w:r>
+              <w:rPr>
+                <w:sz w:val="18"/>
+                <w:szCs w:val="18"/>
+              </w:rPr>
+              <w:t>Decision Matrix geschrieben</w:t>
+            </w:r>
+          </w:p>
+          <w:p>
+            <w:pPr>
+              <w:pStyle w:val="ListParagraph"/>
+              <w:numPr>
+                <w:ilvl w:val="0"/>
+                <w:numId w:val="10"/>
+              </w:numPr>
+              <w:rPr>
+                <w:sz w:val="18"/>
+                <w:szCs w:val="18"/>
+              </w:rPr>
+            </w:pPr>
+            <w:r>
+              <w:rPr>
+                <w:sz w:val="18"/>
+                <w:szCs w:val="18"/>
+              </w:rPr>
+              <w:t>Expertenbesuch</w:t>
+            </w:r>
+          </w:p>
+          <w:p>
+            <w:pPr>
+              <w:pStyle w:val="ListParagraph"/>
+              <w:numPr>
+                <w:ilvl w:val="0"/>
+                <w:numId w:val="10"/>
+              </w:numPr>
+              <w:rPr>
+                <w:sz w:val="18"/>
+                <w:szCs w:val="18"/>
+              </w:rPr>
+            </w:pPr>
+            <w:r>
+              <w:rPr>
+                <w:sz w:val="18"/>
+                <w:szCs w:val="18"/>
+              </w:rPr>
+              <w:t>Wireframes erstellt</w:t>
+            </w:r>
           </w:p>
         </w:tc>
       </w:tr>
@@ -12007,6 +12384,83 @@
                 <w:szCs w:val="18"/>
               </w:rPr>
             </w:pPr>
+            <w:r>
+              <w:rPr>
+                <w:sz w:val="18"/>
+                <w:szCs w:val="18"/>
+              </w:rPr>
+              <w:t xml:space="preserve">Heute bin ich besser in die Arbeit gestartet, durch den Zeitplan weiss ich </w:t>
+            </w:r>
+            <w:r>
+              <w:rPr>
+                <w:sz w:val="18"/>
+                <w:szCs w:val="18"/>
+              </w:rPr>
+              <w:t>genau,</w:t>
+            </w:r>
+            <w:r>
+              <w:rPr>
+                <w:sz w:val="18"/>
+                <w:szCs w:val="18"/>
+              </w:rPr>
+              <w:t xml:space="preserve"> was ich machen muss. </w:t>
+            </w:r>
+            <w:r>
+              <w:rPr>
+                <w:sz w:val="18"/>
+                <w:szCs w:val="18"/>
+              </w:rPr>
+              <w:t xml:space="preserve">Ich konnte meine Arbeiten für heute erledigen und Vorarbeit für morgen machen, so dass ich direkt anfangen kann mit </w:t>
+            </w:r>
+            <w:r>
+              <w:rPr>
+                <w:sz w:val="18"/>
+                <w:szCs w:val="18"/>
+              </w:rPr>
+              <w:t>dem Aufsetzen</w:t>
+            </w:r>
+            <w:r>
+              <w:rPr>
+                <w:sz w:val="18"/>
+                <w:szCs w:val="18"/>
+              </w:rPr>
+              <w:t xml:space="preserve"> </w:t>
+            </w:r>
+            <w:r>
+              <w:rPr>
+                <w:sz w:val="18"/>
+                <w:szCs w:val="18"/>
+              </w:rPr>
+              <w:t>des Projekts</w:t>
+            </w:r>
+            <w:r>
+              <w:rPr>
+                <w:sz w:val="18"/>
+                <w:szCs w:val="18"/>
+              </w:rPr>
+              <w:t xml:space="preserve">. </w:t>
+            </w:r>
+            <w:r>
+              <w:rPr>
+                <w:sz w:val="18"/>
+                <w:szCs w:val="18"/>
+              </w:rPr>
+              <w:t>Ich habe keine Probleme mit der Arbeit bisher und ich hoffe das bleibt auch so.</w:t>
+            </w:r>
+            <w:r>
+              <w:rPr>
+                <w:sz w:val="18"/>
+                <w:szCs w:val="18"/>
+              </w:rPr>
+              <w:t xml:space="preserve"> Das Expertengespräch verlief auch gut, ich konnte meine Fragen stellen und </w:t>
+            </w:r>
+            <w:r>
+              <w:rPr>
+                <w:sz w:val="18"/>
+                <w:szCs w:val="18"/>
+              </w:rPr>
+              <w:t>bekam gute passende antworten.</w:t>
+            </w:r>
           </w:p>
         </w:tc>
       </w:tr>
@@ -12255,6 +12709,7 @@
               <w:tc>
                 <w:tcPr>
                   <w:tcW w:w="5357" w:type="dxa"/>
+                  <w:shd w:val="clear" w:color="auto" w:fill="00B050"/>
                   <w:vAlign w:val="center"/>
                   <w:hideMark/>
                 </w:tcPr>
@@ -12280,6 +12735,38 @@
                 </w:p>
               </w:tc>
             </w:tr>
+            <w:tr>
+              <w:trPr>
+                <w:trHeight w:val="443"/>
+              </w:trPr>
+              <w:tc>
+                <w:tcPr>
+                  <w:tcW w:w="5357" w:type="dxa"/>
+                  <w:shd w:val="clear" w:color="auto" w:fill="00B050"/>
+                  <w:vAlign w:val="center"/>
+                </w:tcPr>
+                <w:p>
+                  <w:pPr>
+                    <w:jc w:val="center"/>
+                    <w:rPr>
+                      <w:rFonts w:ascii="Arial" w:hAnsi="Arial" w:cs="Arial"/>
+                      <w:color w:val="111111"/>
+                      <w:sz w:val="18"/>
+                      <w:szCs w:val="18"/>
+                    </w:rPr>
+                  </w:pPr>
+                  <w:r>
+                    <w:rPr>
+                      <w:rFonts w:ascii="Arial" w:hAnsi="Arial" w:cs="Arial"/>
+                      <w:color w:val="111111"/>
+                      <w:sz w:val="18"/>
+                      <w:szCs w:val="18"/>
+                    </w:rPr>
+                    <w:t>Variantenvergleich &amp; Entscheide dokumentieren</w:t>
+                  </w:r>
+                </w:p>
+              </w:tc>
+            </w:tr>
           </w:tbl>
           <w:p>
             <w:pPr>
@@ -12296,6 +12783,13 @@
                 <w:szCs w:val="18"/>
               </w:rPr>
             </w:pPr>
+            <w:r>
+              <w:rPr>
+                <w:sz w:val="18"/>
+                <w:szCs w:val="18"/>
+              </w:rPr>
+              <w:t>Der letzte Punkt ist eigentlich morgen im Zeitplan, ich konnte ihn aber dennoch heute schon beenden.</w:t>
+            </w:r>
           </w:p>
         </w:tc>
       </w:tr>
@@ -12382,8 +12876,9 @@
       <w:pPr>
         <w:pStyle w:val="Heading1"/>
       </w:pPr>
-      <w:bookmarkStart w:id="18" w:name="_Toc226533052"/>
-      <w:r>
+      <w:bookmarkStart w:id="18" w:name="_Toc226552611"/>
+      <w:r>
+        <w:lastRenderedPageBreak/>
         <w:t>4. Persönliches Fazit</w:t>
       </w:r>
       <w:bookmarkEnd w:id="18"/>
@@ -12392,7 +12887,7 @@
       <w:pPr>
         <w:pStyle w:val="Heading2"/>
       </w:pPr>
-      <w:bookmarkStart w:id="19" w:name="_Toc226533053"/>
+      <w:bookmarkStart w:id="19" w:name="_Toc226552612"/>
       <w:r>
         <w:t>4.1 Rückblick auf die IPA</w:t>
       </w:r>
@@ -12402,7 +12897,7 @@
       <w:pPr>
         <w:pStyle w:val="Heading2"/>
       </w:pPr>
-      <w:bookmarkStart w:id="20" w:name="_Toc226533054"/>
+      <w:bookmarkStart w:id="20" w:name="_Toc226552613"/>
       <w:r>
         <w:t xml:space="preserve">4.2 Was hat gut </w:t>
       </w:r>
@@ -12415,7 +12910,7 @@
       <w:pPr>
         <w:pStyle w:val="Heading2"/>
       </w:pPr>
-      <w:bookmarkStart w:id="21" w:name="_Toc226533055"/>
+      <w:bookmarkStart w:id="21" w:name="_Toc226552614"/>
       <w:r>
         <w:t>4.3 Was würde ich anders machen</w:t>
       </w:r>
@@ -12425,7 +12920,7 @@
       <w:pPr>
         <w:pStyle w:val="Heading2"/>
       </w:pPr>
-      <w:bookmarkStart w:id="22" w:name="_Toc226533056"/>
+      <w:bookmarkStart w:id="22" w:name="_Toc226552615"/>
       <w:r>
         <w:t>4.4 Persönlicher Lerngewinn</w:t>
       </w:r>
@@ -12448,7 +12943,7 @@
       <w:pPr>
         <w:pStyle w:val="Heading1"/>
       </w:pPr>
-      <w:bookmarkStart w:id="23" w:name="_Toc226533057"/>
+      <w:bookmarkStart w:id="23" w:name="_Toc226552616"/>
       <w:r>
         <w:rPr>
           <w:highlight w:val="yellow"/>
@@ -12462,7 +12957,7 @@
       <w:pPr>
         <w:pStyle w:val="Heading1"/>
       </w:pPr>
-      <w:bookmarkStart w:id="24" w:name="_Toc226533058"/>
+      <w:bookmarkStart w:id="24" w:name="_Toc226552617"/>
       <w:r>
         <w:t>5. Kurzfassung</w:t>
       </w:r>
@@ -12505,7 +13000,7 @@
       <w:pPr>
         <w:pStyle w:val="Heading1"/>
       </w:pPr>
-      <w:bookmarkStart w:id="25" w:name="_Toc226533059"/>
+      <w:bookmarkStart w:id="25" w:name="_Toc226552618"/>
       <w:r>
         <w:lastRenderedPageBreak/>
         <w:t>6. Informieren</w:t>
@@ -12516,7 +13011,7 @@
       <w:pPr>
         <w:pStyle w:val="Heading2"/>
       </w:pPr>
-      <w:bookmarkStart w:id="26" w:name="_Toc226533060"/>
+      <w:bookmarkStart w:id="26" w:name="_Toc226552619"/>
       <w:r>
         <w:t>6.1 Auftragsanalyse</w:t>
       </w:r>
@@ -12526,7 +13021,7 @@
       <w:pPr>
         <w:pStyle w:val="Heading3"/>
       </w:pPr>
-      <w:bookmarkStart w:id="27" w:name="_Toc226533061"/>
+      <w:bookmarkStart w:id="27" w:name="_Toc226552620"/>
       <w:r>
         <w:t>6.1.1 Ausgangslage und Umfeld</w:t>
       </w:r>
@@ -12541,7 +13036,7 @@
       <w:pPr>
         <w:pStyle w:val="Heading3"/>
       </w:pPr>
-      <w:bookmarkStart w:id="28" w:name="_Toc226533062"/>
+      <w:bookmarkStart w:id="28" w:name="_Toc226552621"/>
       <w:r>
         <w:t>6.1.2 Projektziel</w:t>
       </w:r>
@@ -12561,7 +13056,7 @@
       <w:pPr>
         <w:pStyle w:val="Heading3"/>
       </w:pPr>
-      <w:bookmarkStart w:id="29" w:name="_Toc226533063"/>
+      <w:bookmarkStart w:id="29" w:name="_Toc226552622"/>
       <w:r>
         <w:lastRenderedPageBreak/>
         <w:t>6.1.3 Anforderungsdokumentation</w:t>
@@ -13952,7 +14447,7 @@
       <w:pPr>
         <w:pStyle w:val="Heading3"/>
       </w:pPr>
-      <w:bookmarkStart w:id="31" w:name="_Toc226533064"/>
+      <w:bookmarkStart w:id="31" w:name="_Toc226552623"/>
       <w:r>
         <w:lastRenderedPageBreak/>
         <w:t>6.1.4 Use-Case-Übersicht</w:t>
@@ -15483,7 +15978,7 @@
       <w:pPr>
         <w:pStyle w:val="Heading3"/>
       </w:pPr>
-      <w:bookmarkStart w:id="33" w:name="_Toc226533065"/>
+      <w:bookmarkStart w:id="33" w:name="_Toc226552624"/>
       <w:r>
         <w:lastRenderedPageBreak/>
         <w:t>6.1.5 Kontextdiagra</w:t>
@@ -15602,7 +16097,7 @@
       <w:pPr>
         <w:pStyle w:val="Heading2"/>
       </w:pPr>
-      <w:bookmarkStart w:id="35" w:name="_Toc226533066"/>
+      <w:bookmarkStart w:id="35" w:name="_Toc226552625"/>
       <w:r>
         <w:lastRenderedPageBreak/>
         <w:t>6.2 Informationsrecherche</w:t>
@@ -15817,23 +16312,7 @@
                   <w:sz w:val="18"/>
                   <w:szCs w:val="18"/>
                 </w:rPr>
-                <w:t>https://tiptap.de</w:t>
-              </w:r>
-              <w:r>
-                <w:rPr>
-                  <w:rStyle w:val="Hyperlink"/>
-                  <w:sz w:val="18"/>
-                  <w:szCs w:val="18"/>
-                </w:rPr>
-                <w:t>v</w:t>
-              </w:r>
-              <w:r>
-                <w:rPr>
-                  <w:rStyle w:val="Hyperlink"/>
-                  <w:sz w:val="18"/>
-                  <w:szCs w:val="18"/>
-                </w:rPr>
-                <w:t>/docs</w:t>
+                <w:t>https://tiptap.dev/docs</w:t>
               </w:r>
             </w:hyperlink>
           </w:p>
@@ -16446,7 +16925,7 @@
       <w:pPr>
         <w:pStyle w:val="Heading2"/>
       </w:pPr>
-      <w:bookmarkStart w:id="36" w:name="_Toc226533067"/>
+      <w:bookmarkStart w:id="36" w:name="_Toc226552626"/>
       <w:r>
         <w:t>6.3 Wahl der Projektmethode: IPERKA</w:t>
       </w:r>
@@ -16454,6 +16933,9 @@
     </w:p>
     <w:p>
       <w:r>
+        <w:rPr>
+          <w:noProof/>
+        </w:rPr>
         <w:drawing>
           <wp:inline distT="0" distB="0" distL="0" distR="0" wp14:anchorId="7ECB6700" wp14:editId="5C3B7923">
             <wp:extent cx="3203575" cy="1906905"/>
@@ -16582,7 +17064,7 @@
       <w:pPr>
         <w:pStyle w:val="Heading1"/>
       </w:pPr>
-      <w:bookmarkStart w:id="37" w:name="_Toc226533068"/>
+      <w:bookmarkStart w:id="37" w:name="_Toc226552627"/>
       <w:r>
         <w:lastRenderedPageBreak/>
         <w:t>7. Planen</w:t>
@@ -16593,7 +17075,7 @@
       <w:pPr>
         <w:pStyle w:val="Heading2"/>
       </w:pPr>
-      <w:bookmarkStart w:id="38" w:name="_Toc226533069"/>
+      <w:bookmarkStart w:id="38" w:name="_Toc226552628"/>
       <w:r>
         <w:t>7.1 Entwicklungs- und Laufzeitumgebung</w:t>
       </w:r>
@@ -16603,9 +17085,11 @@
       <w:pPr>
         <w:pStyle w:val="Heading3"/>
       </w:pPr>
+      <w:bookmarkStart w:id="39" w:name="_Toc226552629"/>
       <w:r>
         <w:t>7.1.1 Wichtige Tools</w:t>
       </w:r>
+      <w:bookmarkEnd w:id="39"/>
     </w:p>
     <w:tbl>
       <w:tblPr>
@@ -17836,7 +18320,6 @@
       <w:pPr>
         <w:pStyle w:val="Caption"/>
       </w:pPr>
-      <w:bookmarkStart w:id="39" w:name="_Toc226533070"/>
       <w:r>
         <w:t xml:space="preserve">Tabelle </w:t>
       </w:r>
@@ -17863,13 +18346,63 @@
       </w:r>
     </w:p>
     <w:p>
+      <w:r>
+        <w:t xml:space="preserve">Die Entwicklungsumgebung wurde so eingerichtet, dass das Frontend und das Backend unabhängig voneinander entwickelt und getestet werden können. Beides wird im Visual Studio Code entwickelt. </w:t>
+      </w:r>
+    </w:p>
+    <w:p>
+      <w:r>
+        <w:t xml:space="preserve">Für die Datenbank wird </w:t>
+      </w:r>
+      <w:proofErr w:type="spellStart"/>
+      <w:r>
+        <w:t>pgAdmin</w:t>
+      </w:r>
+      <w:proofErr w:type="spellEnd"/>
+      <w:r>
+        <w:t xml:space="preserve"> 4 verwendet um Tabellen, Daten und Constraints während der Entwicklung ansehen und überprüfen zu können. Für die Versionierung wird </w:t>
+      </w:r>
+      <w:proofErr w:type="spellStart"/>
+      <w:r>
+        <w:t>Git</w:t>
+      </w:r>
+      <w:proofErr w:type="spellEnd"/>
+      <w:r>
+        <w:t xml:space="preserve"> benutzt, nach jedem Arbeitstag wird der aktuelle Stand </w:t>
+      </w:r>
+      <w:proofErr w:type="spellStart"/>
+      <w:r>
+        <w:t>commited</w:t>
+      </w:r>
+      <w:proofErr w:type="spellEnd"/>
+      <w:r>
+        <w:t xml:space="preserve"> und auf das GitHub Repository gepusht.</w:t>
+      </w:r>
+    </w:p>
+    <w:p>
+      <w:r>
+        <w:t xml:space="preserve">Die Laufzeitumgebung basiert auf Docker und Podman Desktop. Alle drei Komponenten werden über eine docker-compose.yml als separate Container gestartet. Diese </w:t>
+      </w:r>
+      <w:r>
+        <w:lastRenderedPageBreak/>
+        <w:t xml:space="preserve">Konfiguration </w:t>
+      </w:r>
+      <w:r>
+        <w:t>ist so</w:t>
+      </w:r>
+      <w:r>
+        <w:t>, dass die Applikation in einer konsistenten Umgebung läuft und auf jedem System identisch reproduziert werden kann.</w:t>
+      </w:r>
+    </w:p>
+    <w:p>
       <w:pPr>
         <w:pStyle w:val="Heading3"/>
       </w:pPr>
-      <w:r>
-        <w:lastRenderedPageBreak/>
+      <w:bookmarkStart w:id="40" w:name="_Toc226552630"/>
+      <w:r>
         <w:t>7.1.2 Architekturdiagramm</w:t>
       </w:r>
+      <w:bookmarkEnd w:id="40"/>
     </w:p>
     <w:p>
       <w:r>
@@ -17970,10 +18503,11 @@
       <w:pPr>
         <w:pStyle w:val="Heading2"/>
       </w:pPr>
+      <w:bookmarkStart w:id="41" w:name="_Toc226552631"/>
       <w:r>
         <w:t>7.2 Risikomanagement</w:t>
       </w:r>
-      <w:bookmarkEnd w:id="39"/>
+      <w:bookmarkEnd w:id="41"/>
     </w:p>
     <w:p>
       <w:pPr>
@@ -18006,22 +18540,22 @@
       <w:pPr>
         <w:pStyle w:val="Heading2"/>
       </w:pPr>
-      <w:bookmarkStart w:id="40" w:name="_Toc226533071"/>
+      <w:bookmarkStart w:id="42" w:name="_Toc226552632"/>
       <w:r>
         <w:lastRenderedPageBreak/>
         <w:t>7.3 Datenmodell (ERD)</w:t>
       </w:r>
-      <w:bookmarkEnd w:id="40"/>
+      <w:bookmarkEnd w:id="42"/>
     </w:p>
     <w:p>
       <w:pPr>
         <w:pStyle w:val="Heading3"/>
       </w:pPr>
-      <w:bookmarkStart w:id="41" w:name="_Toc226533072"/>
+      <w:bookmarkStart w:id="43" w:name="_Toc226552633"/>
       <w:r>
         <w:t>7.3.1 Begründung der Modellierungsmethodik</w:t>
       </w:r>
-      <w:bookmarkEnd w:id="41"/>
+      <w:bookmarkEnd w:id="43"/>
     </w:p>
     <w:p>
       <w:r>
@@ -18092,12 +18626,12 @@
       <w:pPr>
         <w:pStyle w:val="Heading3"/>
       </w:pPr>
-      <w:bookmarkStart w:id="42" w:name="_Toc226533073"/>
+      <w:bookmarkStart w:id="44" w:name="_Toc226552634"/>
       <w:r>
         <w:lastRenderedPageBreak/>
         <w:t>7.3.2 ER-Diagramm</w:t>
       </w:r>
-      <w:bookmarkEnd w:id="42"/>
+      <w:bookmarkEnd w:id="44"/>
     </w:p>
     <w:p>
       <w:r>
@@ -18178,14 +18712,244 @@
     </w:p>
     <w:p>
       <w:pPr>
+        <w:pStyle w:val="Heading2"/>
+      </w:pPr>
+      <w:bookmarkStart w:id="45" w:name="_Toc226552635"/>
+      <w:r>
+        <w:lastRenderedPageBreak/>
+        <w:t>7.4 UI-Planung (Wireframes)</w:t>
+      </w:r>
+      <w:bookmarkEnd w:id="45"/>
+    </w:p>
+    <w:p>
+      <w:r>
+        <w:rPr>
+          <w:noProof/>
+        </w:rPr>
+        <w:drawing>
+          <wp:inline distT="0" distB="0" distL="0" distR="0" wp14:anchorId="1DCE652A" wp14:editId="6E947CFD">
+            <wp:extent cx="6000006" cy="3217333"/>
+            <wp:effectExtent l="0" t="0" r="0" b="0"/>
+            <wp:docPr id="379694925" name="Picture 3"/>
+            <wp:cNvGraphicFramePr>
+              <a:graphicFrameLocks xmlns:a="http://schemas.openxmlformats.org/drawingml/2006/main" noChangeAspect="1"/>
+            </wp:cNvGraphicFramePr>
+            <a:graphic xmlns:a="http://schemas.openxmlformats.org/drawingml/2006/main">
+              <a:graphicData uri="http://schemas.openxmlformats.org/drawingml/2006/picture">
+                <pic:pic xmlns:pic="http://schemas.openxmlformats.org/drawingml/2006/picture">
+                  <pic:nvPicPr>
+                    <pic:cNvPr id="379694925" name="Picture 379694925"/>
+                    <pic:cNvPicPr/>
+                  </pic:nvPicPr>
+                  <pic:blipFill rotWithShape="1">
+                    <a:blip r:embed="rId30" cstate="print">
+                      <a:extLst>
+                        <a:ext uri="{28A0092B-C50C-407E-A947-70E740481C1C}">
+                          <a14:useLocalDpi xmlns:a14="http://schemas.microsoft.com/office/drawing/2010/main" val="0"/>
+                        </a:ext>
+                      </a:extLst>
+                    </a:blip>
+                    <a:srcRect t="15470" b="13032"/>
+                    <a:stretch>
+                      <a:fillRect/>
+                    </a:stretch>
+                  </pic:blipFill>
+                  <pic:spPr bwMode="auto">
+                    <a:xfrm>
+                      <a:off x="0" y="0"/>
+                      <a:ext cx="6104071" cy="3273135"/>
+                    </a:xfrm>
+                    <a:prstGeom prst="rect">
+                      <a:avLst/>
+                    </a:prstGeom>
+                    <a:ln>
+                      <a:noFill/>
+                    </a:ln>
+                    <a:extLst>
+                      <a:ext uri="{53640926-AAD7-44D8-BBD7-CCE9431645EC}">
+                        <a14:shadowObscured xmlns:a14="http://schemas.microsoft.com/office/drawing/2010/main"/>
+                      </a:ext>
+                    </a:extLst>
+                  </pic:spPr>
+                </pic:pic>
+              </a:graphicData>
+            </a:graphic>
+          </wp:inline>
+        </w:drawing>
+      </w:r>
+    </w:p>
+    <w:p>
+      <w:r>
+        <w:t>Diese Wireframes wurden auf Papier erstellt, um den grundlegenden Screen-Flow und die Benutzeroberfläche vor der Implementierung zu planen. Das Ziel war es die wichtigsten UI-Elemente und den Navigationsfluss frühzeitig festzulegen ohne viel Zeit in ein Detailliertes Design zu investieren.</w:t>
+      </w:r>
+    </w:p>
+    <w:p>
+      <w:pPr>
+        <w:rPr>
+          <w:b/>
+          <w:bCs/>
+        </w:rPr>
+      </w:pPr>
+      <w:r>
+        <w:rPr>
+          <w:b/>
+          <w:bCs/>
+        </w:rPr>
+        <w:t>Login Screen:</w:t>
+      </w:r>
+    </w:p>
+    <w:p>
+      <w:r>
+        <w:t>Besteht aus einem einfachen Formular mit Benutzernamen und Passwort sowie einem Login Button. Bei einer falscher Passwort Eingabe wird ein Fehler angezeigt. Das eingegebene Passwort wird maskiert, so dass niemand sehen kann, was eingegeben wird.</w:t>
+      </w:r>
+    </w:p>
+    <w:p>
+      <w:pPr>
+        <w:rPr>
+          <w:b/>
+          <w:bCs/>
+        </w:rPr>
+      </w:pPr>
+      <w:r>
+        <w:rPr>
+          <w:b/>
+          <w:bCs/>
+        </w:rPr>
+        <w:t>Template Screen:</w:t>
+      </w:r>
+    </w:p>
+    <w:p>
+      <w:r>
+        <w:t xml:space="preserve">Der Template Screen zeigt eine Übersicht über alle vorhandenen Templates. Man kann durch einen Button ein neues Template erstellen und auch Soft-deleten also archivieren. Man kann auch durch die Navigation im Header zwischen den </w:t>
+      </w:r>
+      <w:r>
+        <w:t xml:space="preserve">zwei </w:t>
+      </w:r>
+      <w:r>
+        <w:t xml:space="preserve">verschiedenen Seiten navigieren. </w:t>
+      </w:r>
+    </w:p>
+    <w:p>
+      <w:pPr>
+        <w:rPr>
+          <w:b/>
+          <w:bCs/>
+        </w:rPr>
+      </w:pPr>
+      <w:r>
+        <w:rPr>
+          <w:b/>
+          <w:bCs/>
+        </w:rPr>
+        <w:t>Document Screen:</w:t>
+      </w:r>
+    </w:p>
+    <w:p>
+      <w:r>
+        <w:t>Ist sehr ähnlich aufgebaut wie der Template-screen. Er zeigt eine Übersicht von allen SAD-Dokumenten mit Export, Delete und Edit Button. Von hier können Dokumente geöffnet werden.</w:t>
+      </w:r>
+    </w:p>
+    <w:p>
+      <w:pPr>
+        <w:rPr>
+          <w:b/>
+          <w:bCs/>
+        </w:rPr>
+      </w:pPr>
+      <w:r>
+        <w:rPr>
+          <w:b/>
+          <w:bCs/>
+        </w:rPr>
+        <w:lastRenderedPageBreak/>
+        <w:t>Create Template:</w:t>
+      </w:r>
+    </w:p>
+    <w:p>
+      <w:r>
+        <w:t xml:space="preserve">Der Create Template Screen zeigt ein Formular mit einem Titel-Feld und einem Rich-Text-Editor zur Definition der Template-Struktur, abgeschlossen mit Save und </w:t>
+      </w:r>
+      <w:proofErr w:type="spellStart"/>
+      <w:r>
+        <w:t>Cancel</w:t>
+      </w:r>
+      <w:proofErr w:type="spellEnd"/>
+      <w:r>
+        <w:t xml:space="preserve"> Buttons. </w:t>
+      </w:r>
+    </w:p>
+    <w:p>
+      <w:pPr>
+        <w:rPr>
+          <w:b/>
+          <w:bCs/>
+        </w:rPr>
+      </w:pPr>
+      <w:r>
+        <w:rPr>
+          <w:b/>
+          <w:bCs/>
+        </w:rPr>
+        <w:t>Edit Document:</w:t>
+      </w:r>
+    </w:p>
+    <w:p>
+      <w:r>
+        <w:t xml:space="preserve">Der Edit Document Screen zeigt den eigentlichen SAD-Editor. </w:t>
+      </w:r>
+      <w:r>
+        <w:t>Es gibt</w:t>
+      </w:r>
+      <w:r>
+        <w:t xml:space="preserve"> ein Titel-Feld für den Dokumentnamen sowie der Rich-Text-Bereich für den Inhalt</w:t>
+      </w:r>
+      <w:r>
+        <w:t xml:space="preserve"> mit einer </w:t>
+      </w:r>
+      <w:proofErr w:type="spellStart"/>
+      <w:r>
+        <w:t>Formatting</w:t>
+      </w:r>
+      <w:proofErr w:type="spellEnd"/>
+      <w:r>
+        <w:t xml:space="preserve"> Toolbar für die wichtigsten Dokument Formatierungen</w:t>
+      </w:r>
+      <w:r>
+        <w:t>. Ein Back-Button ermöglicht die Rückkehr zur Dokumentübersicht, ohne den Inhalt zu verlieren.</w:t>
+      </w:r>
+    </w:p>
+    <w:p>
+      <w:pPr>
+        <w:rPr>
+          <w:rFonts w:asciiTheme="majorHAnsi" w:eastAsiaTheme="majorEastAsia" w:hAnsiTheme="majorHAnsi" w:cstheme="majorBidi"/>
+          <w:color w:val="470173"/>
+          <w:sz w:val="40"/>
+          <w:szCs w:val="40"/>
+        </w:rPr>
+      </w:pPr>
+      <w:r>
+        <w:t xml:space="preserve">Die fertige Implementierung orientiert sich an diesen Wireframes. </w:t>
+      </w:r>
+      <w:r>
+        <w:t xml:space="preserve">Das finale Resultat wird </w:t>
+      </w:r>
+      <w:r>
+        <w:t xml:space="preserve">in Kapitel 9.8 dokumentiert. </w:t>
+      </w:r>
+      <w:r>
+        <w:br w:type="page"/>
+      </w:r>
+    </w:p>
+    <w:p>
+      <w:pPr>
         <w:pStyle w:val="Heading1"/>
       </w:pPr>
-      <w:bookmarkStart w:id="43" w:name="_Toc226533074"/>
+      <w:bookmarkStart w:id="46" w:name="_Toc226552636"/>
       <w:r>
         <w:lastRenderedPageBreak/>
         <w:t>8. Entscheiden</w:t>
       </w:r>
-      <w:bookmarkEnd w:id="43"/>
+      <w:bookmarkEnd w:id="46"/>
       <w:r>
         <w:t xml:space="preserve"> </w:t>
       </w:r>
@@ -18194,11 +18958,11 @@
       <w:pPr>
         <w:pStyle w:val="Heading2"/>
       </w:pPr>
-      <w:bookmarkStart w:id="44" w:name="_Toc226533075"/>
+      <w:bookmarkStart w:id="47" w:name="_Toc226552637"/>
       <w:r>
         <w:t>8.1 Rich-Text-Editor Library</w:t>
       </w:r>
-      <w:bookmarkEnd w:id="44"/>
+      <w:bookmarkEnd w:id="47"/>
     </w:p>
     <w:p/>
     <w:tbl>
@@ -18244,7 +19008,6 @@
             <w:vAlign w:val="center"/>
           </w:tcPr>
           <w:p>
-            <w:bookmarkStart w:id="45" w:name="_Toc226533076"/>
             <w:r>
               <w:t>Kriterium</w:t>
             </w:r>
@@ -18407,14 +19170,7 @@
                 <w:sz w:val="18"/>
                 <w:szCs w:val="18"/>
               </w:rPr>
-              <w:t xml:space="preserve"> </w:t>
-            </w:r>
-            <w:r>
-              <w:rPr>
-                <w:sz w:val="18"/>
-                <w:szCs w:val="18"/>
-              </w:rPr>
-              <w:t>React-Integration</w:t>
+              <w:t xml:space="preserve"> React-Integration</w:t>
             </w:r>
           </w:p>
         </w:tc>
@@ -18553,14 +19309,7 @@
                 <w:sz w:val="18"/>
                 <w:szCs w:val="18"/>
               </w:rPr>
-              <w:t xml:space="preserve"> </w:t>
-            </w:r>
-            <w:r>
-              <w:rPr>
-                <w:sz w:val="18"/>
-                <w:szCs w:val="18"/>
-              </w:rPr>
-              <w:t xml:space="preserve">Lizenz </w:t>
+              <w:t xml:space="preserve"> Lizenz </w:t>
             </w:r>
             <w:r>
               <w:rPr>
@@ -18700,14 +19449,7 @@
                 <w:sz w:val="18"/>
                 <w:szCs w:val="18"/>
               </w:rPr>
-              <w:t xml:space="preserve"> </w:t>
-            </w:r>
-            <w:r>
-              <w:rPr>
-                <w:sz w:val="18"/>
-                <w:szCs w:val="18"/>
-              </w:rPr>
-              <w:t>Sanitizing-Support</w:t>
+              <w:t xml:space="preserve"> Sanitizing-Support</w:t>
             </w:r>
           </w:p>
         </w:tc>
@@ -18803,14 +19545,7 @@
                 <w:sz w:val="18"/>
                 <w:szCs w:val="18"/>
               </w:rPr>
-              <w:t xml:space="preserve">3 – Kein eingebautes Sanitizing, </w:t>
-            </w:r>
-            <w:r>
-              <w:rPr>
-                <w:sz w:val="18"/>
-                <w:szCs w:val="18"/>
-              </w:rPr>
-              <w:t>jsoup nötig</w:t>
+              <w:t>3 – Kein eingebautes Sanitizing, jsoup nötig</w:t>
             </w:r>
           </w:p>
         </w:tc>
@@ -18846,14 +19581,7 @@
                 <w:sz w:val="18"/>
                 <w:szCs w:val="18"/>
               </w:rPr>
-              <w:t xml:space="preserve"> </w:t>
-            </w:r>
-            <w:r>
-              <w:rPr>
-                <w:sz w:val="18"/>
-                <w:szCs w:val="18"/>
-              </w:rPr>
-              <w:t>Dokumentationsqualität</w:t>
+              <w:t xml:space="preserve"> Dokumentationsqualität</w:t>
             </w:r>
           </w:p>
         </w:tc>
@@ -19170,10 +19898,11 @@
         <w:lastRenderedPageBreak/>
         <w:br w:type="textWrapping" w:clear="all"/>
       </w:r>
+      <w:bookmarkStart w:id="48" w:name="_Toc226552638"/>
       <w:r>
         <w:t>8.2 PDF-Generierung Library</w:t>
       </w:r>
-      <w:bookmarkEnd w:id="45"/>
+      <w:bookmarkEnd w:id="48"/>
     </w:p>
     <w:tbl>
       <w:tblPr>
@@ -19218,7 +19947,6 @@
             <w:vAlign w:val="center"/>
           </w:tcPr>
           <w:p>
-            <w:bookmarkStart w:id="46" w:name="_Toc226533077"/>
             <w:r>
               <w:t>Kriterium</w:t>
             </w:r>
@@ -20193,13 +20921,7 @@
         <w:fldChar w:fldCharType="end"/>
       </w:r>
       <w:r>
-        <w:t xml:space="preserve"> - </w:t>
-      </w:r>
-      <w:r>
-        <w:t xml:space="preserve">Decision Matrix </w:t>
-      </w:r>
-      <w:r>
-        <w:t>PDF-Generierung Library</w:t>
+        <w:t xml:space="preserve"> - Decision Matrix PDF-Generierung Library</w:t>
       </w:r>
     </w:p>
     <w:p>
@@ -20226,139 +20948,134 @@
       <w:pPr>
         <w:pStyle w:val="Heading2"/>
       </w:pPr>
+      <w:bookmarkStart w:id="49" w:name="_Toc226552639"/>
       <w:r>
         <w:t>8.3 Datenbankwahl: PostgreSQL</w:t>
-      </w:r>
-      <w:bookmarkStart w:id="47" w:name="_Toc226533078"/>
-      <w:bookmarkEnd w:id="46"/>
-    </w:p>
-    <w:p>
-      <w:r>
-        <w:t xml:space="preserve">PostgreSQL wurde als Datenbank gewählt, weil es sich optimal in die Docker-basierte Infrastruktur integriert und ein offizielles Docker-Image bereitstellt. Im Vergleich zu MySQL bietet PostgreSQL eine bessere UUID-Unterstützung als nativen Datentyp und robusteres Verhalten bei Constraints. </w:t>
-      </w:r>
-      <w:r>
-        <w:t>Die In-Memory Datenbank H2</w:t>
-      </w:r>
-      <w:r>
-        <w:t xml:space="preserve"> </w:t>
-      </w:r>
-      <w:r>
-        <w:t>wurde,</w:t>
-      </w:r>
-      <w:r>
-        <w:t xml:space="preserve"> ausgeschlossen, da die Daten über Container-Neustarts erhalten bleiben müssen und H2 </w:t>
-      </w:r>
-      <w:r>
-        <w:t>hauptsächlich</w:t>
-      </w:r>
-      <w:r>
-        <w:t xml:space="preserve"> für Tests geeignet ist. Spring Boot unterstützt PostgreSQL über Spring Data JPA ohne zusätzliche Konfiguration, was die Integration</w:t>
-      </w:r>
-      <w:r>
-        <w:t xml:space="preserve"> um einiges</w:t>
-      </w:r>
-      <w:r>
-        <w:t xml:space="preserve"> vereinfacht.</w:t>
-      </w:r>
-    </w:p>
-    <w:p>
-      <w:pPr>
-        <w:pStyle w:val="Heading2"/>
-      </w:pPr>
-      <w:r>
-        <w:lastRenderedPageBreak/>
-        <w:t>8.4 Weitere Entscheide</w:t>
-      </w:r>
-      <w:bookmarkEnd w:id="47"/>
-    </w:p>
-    <w:p>
-      <w:pPr>
-        <w:pStyle w:val="Heading2"/>
-      </w:pPr>
-    </w:p>
-    <w:p>
-      <w:pPr>
-        <w:pStyle w:val="Heading1"/>
-      </w:pPr>
-      <w:bookmarkStart w:id="48" w:name="_Toc226533079"/>
-      <w:r>
-        <w:t>9. Realisieren</w:t>
-      </w:r>
-      <w:bookmarkEnd w:id="48"/>
-    </w:p>
-    <w:p>
-      <w:pPr>
-        <w:pStyle w:val="Heading2"/>
-      </w:pPr>
-      <w:bookmarkStart w:id="49" w:name="_Toc226533080"/>
-      <w:r>
-        <w:t>9.1 Datenbank Implementierung</w:t>
       </w:r>
       <w:bookmarkEnd w:id="49"/>
     </w:p>
     <w:p>
-      <w:pPr>
-        <w:pStyle w:val="Heading3"/>
-      </w:pPr>
-      <w:bookmarkStart w:id="50" w:name="_Toc226533081"/>
-      <w:r>
-        <w:t>9.1.1 SQL-Schema</w:t>
+      <w:r>
+        <w:t xml:space="preserve">PostgreSQL wurde als Datenbank gewählt, weil es sich optimal in die Docker-basierte Infrastruktur integriert und ein offizielles Docker-Image bereitstellt. Im Vergleich zu MySQL bietet PostgreSQL eine bessere UUID-Unterstützung als nativen Datentyp und robusteres Verhalten bei Constraints. </w:t>
+      </w:r>
+      <w:r>
+        <w:t>Die In-Memory Datenbank H2</w:t>
+      </w:r>
+      <w:r>
+        <w:t xml:space="preserve"> wurde, ausgeschlossen, da die Daten über Container-Neustarts erhalten bleiben müssen und H2 </w:t>
+      </w:r>
+      <w:r>
+        <w:t>hauptsächlich</w:t>
+      </w:r>
+      <w:r>
+        <w:t xml:space="preserve"> für Tests geeignet ist. Spring Boot unterstützt PostgreSQL über Spring Data JPA ohne zusätzliche Konfiguration, was die Integration</w:t>
+      </w:r>
+      <w:r>
+        <w:t xml:space="preserve"> um einiges</w:t>
+      </w:r>
+      <w:r>
+        <w:t xml:space="preserve"> vereinfacht.</w:t>
+      </w:r>
+    </w:p>
+    <w:p>
+      <w:pPr>
+        <w:pStyle w:val="Heading2"/>
+      </w:pPr>
+      <w:bookmarkStart w:id="50" w:name="_Toc226552640"/>
+      <w:r>
+        <w:lastRenderedPageBreak/>
+        <w:t>8.4 Weitere Entscheide</w:t>
       </w:r>
       <w:bookmarkEnd w:id="50"/>
     </w:p>
     <w:p>
       <w:pPr>
-        <w:pStyle w:val="Heading3"/>
-      </w:pPr>
-      <w:bookmarkStart w:id="51" w:name="_Toc226533082"/>
-      <w:r>
-        <w:t>9.1.2 Sicherheit und Integrität</w:t>
+        <w:rPr>
+          <w:b/>
+          <w:bCs/>
+        </w:rPr>
+      </w:pPr>
+      <w:r>
+        <w:rPr>
+          <w:b/>
+          <w:bCs/>
+        </w:rPr>
+        <w:t>Mock-Auth statt JWT:</w:t>
+      </w:r>
+    </w:p>
+    <w:p>
+      <w:r>
+        <w:t>Für diese IPA wurde Basic Authentication mit einem Mock Benutzer gewählt, da eine vollständige JWT-Implementierung zu aufwändig wäre im 10 Tage Zeitraum. Basic Auth ist in Spring Security mit wenigen Zeilen konfigurierbar und reicht komplett aus für unseren vordefinierten Mock User. Die Architektur ist so aufgebaut, dass die Authentifizierung später durch ein produktives Modul auf Kunden Seite ersetzt werden kann.</w:t>
+      </w:r>
+    </w:p>
+    <w:p>
+      <w:pPr>
+        <w:rPr>
+          <w:b/>
+          <w:bCs/>
+        </w:rPr>
+      </w:pPr>
+      <w:r>
+        <w:rPr>
+          <w:b/>
+          <w:bCs/>
+        </w:rPr>
+        <w:t>CORS restriktiv:</w:t>
+      </w:r>
+    </w:p>
+    <w:p>
+      <w:r>
+        <w:t>Die CORS-Konfiguration wird bewusst restriktiv gehalten, nur der Port des Frontend-Container wird als erlaubter Origin eingetragen. Requests von anderen Origins werden abgelehnt. Diese Entscheidung enzspricht den Anforderungen und verhindert unautorisierten API-Zugriff von ausserhalb.</w:t>
+      </w:r>
+    </w:p>
+    <w:p>
+      <w:pPr>
+        <w:pStyle w:val="Heading1"/>
+      </w:pPr>
+      <w:bookmarkStart w:id="51" w:name="_Toc226552641"/>
+      <w:r>
+        <w:lastRenderedPageBreak/>
+        <w:t>9. Realisieren</w:t>
       </w:r>
       <w:bookmarkEnd w:id="51"/>
     </w:p>
     <w:p>
       <w:pPr>
-        <w:pStyle w:val="Heading3"/>
-      </w:pPr>
-      <w:bookmarkStart w:id="52" w:name="_Toc226533083"/>
-      <w:r>
-        <w:t>9.1.3 Indexierung und Performance</w:t>
+        <w:pStyle w:val="Heading2"/>
+      </w:pPr>
+      <w:bookmarkStart w:id="52" w:name="_Toc226552642"/>
+      <w:r>
+        <w:t>9.1 Datenbank Implementierung</w:t>
       </w:r>
       <w:bookmarkEnd w:id="52"/>
     </w:p>
     <w:p>
       <w:pPr>
-        <w:pStyle w:val="Heading2"/>
-      </w:pPr>
-      <w:bookmarkStart w:id="53" w:name="_Toc226533084"/>
-      <w:r>
-        <w:t>9.2 Backend – Projekt-Setup und Architektur</w:t>
+        <w:pStyle w:val="Heading3"/>
+      </w:pPr>
+      <w:bookmarkStart w:id="53" w:name="_Toc226552643"/>
+      <w:r>
+        <w:t>9.1.1 SQL-Schema</w:t>
       </w:r>
       <w:bookmarkEnd w:id="53"/>
     </w:p>
     <w:p>
       <w:pPr>
-        <w:pStyle w:val="Heading2"/>
-      </w:pPr>
-      <w:bookmarkStart w:id="54" w:name="_Toc226533085"/>
-      <w:r>
-        <w:t>9.3 Backend – User-Service (Basic Auth)</w:t>
+        <w:pStyle w:val="Heading3"/>
+      </w:pPr>
+      <w:bookmarkStart w:id="54" w:name="_Toc226552644"/>
+      <w:r>
+        <w:t>9.1.2 Sicherheit und Integrität</w:t>
       </w:r>
       <w:bookmarkEnd w:id="54"/>
     </w:p>
     <w:p>
       <w:pPr>
-        <w:pStyle w:val="Heading2"/>
-      </w:pPr>
-      <w:bookmarkStart w:id="55" w:name="_Toc226533086"/>
-      <w:r>
-        <w:t>9.4 Backend – Te</w:t>
-      </w:r>
-      <w:r>
-        <w:t>m</w:t>
-      </w:r>
-      <w:r>
-        <w:t>plate Service</w:t>
+        <w:pStyle w:val="Heading3"/>
+      </w:pPr>
+      <w:bookmarkStart w:id="55" w:name="_Toc226552645"/>
+      <w:r>
+        <w:t>9.1.3 Indexierung und Performance</w:t>
       </w:r>
       <w:bookmarkEnd w:id="55"/>
     </w:p>
@@ -20366,19 +21083,19 @@
       <w:pPr>
         <w:pStyle w:val="Heading2"/>
       </w:pPr>
-      <w:bookmarkStart w:id="56" w:name="_Toc226533087"/>
-      <w:r>
-        <w:t>9.5 Backend – Document-Services + PDF-Generierung</w:t>
+      <w:bookmarkStart w:id="56" w:name="_Toc226552646"/>
+      <w:r>
+        <w:t>9.2 Backend – Projekt-Setup und Architektur</w:t>
       </w:r>
       <w:bookmarkEnd w:id="56"/>
     </w:p>
     <w:p>
       <w:pPr>
-        <w:pStyle w:val="Heading3"/>
-      </w:pPr>
-      <w:bookmarkStart w:id="57" w:name="_Toc226533088"/>
-      <w:r>
-        <w:t>9.5.1 Input Sanitizing</w:t>
+        <w:pStyle w:val="Heading2"/>
+      </w:pPr>
+      <w:bookmarkStart w:id="57" w:name="_Toc226552647"/>
+      <w:r>
+        <w:t>9.3 Backend – User-Service (Basic Auth)</w:t>
       </w:r>
       <w:bookmarkEnd w:id="57"/>
     </w:p>
@@ -20386,39 +21103,45 @@
       <w:pPr>
         <w:pStyle w:val="Heading2"/>
       </w:pPr>
-      <w:bookmarkStart w:id="58" w:name="_Toc226533089"/>
-      <w:r>
-        <w:t>9.6 REST-API Dokumentation</w:t>
+      <w:bookmarkStart w:id="58" w:name="_Toc226552648"/>
+      <w:r>
+        <w:t>9.4 Backend – Te</w:t>
+      </w:r>
+      <w:r>
+        <w:t>m</w:t>
+      </w:r>
+      <w:r>
+        <w:t>plate Service</w:t>
       </w:r>
       <w:bookmarkEnd w:id="58"/>
     </w:p>
     <w:p>
       <w:pPr>
-        <w:pStyle w:val="Heading3"/>
-      </w:pPr>
-      <w:bookmarkStart w:id="59" w:name="_Toc226533090"/>
-      <w:r>
-        <w:t>9.6.1 Request / Response Beispiele</w:t>
+        <w:pStyle w:val="Heading2"/>
+      </w:pPr>
+      <w:bookmarkStart w:id="59" w:name="_Toc226552649"/>
+      <w:r>
+        <w:t>9.5 Backend – Document-Services + PDF-Generierung</w:t>
       </w:r>
       <w:bookmarkEnd w:id="59"/>
     </w:p>
     <w:p>
       <w:pPr>
-        <w:pStyle w:val="Heading2"/>
-      </w:pPr>
-      <w:bookmarkStart w:id="60" w:name="_Toc226533091"/>
-      <w:r>
-        <w:t>9.7 Docker-Setup</w:t>
+        <w:pStyle w:val="Heading3"/>
+      </w:pPr>
+      <w:bookmarkStart w:id="60" w:name="_Toc226552650"/>
+      <w:r>
+        <w:t>9.5.1 Input Sanitizing</w:t>
       </w:r>
       <w:bookmarkEnd w:id="60"/>
     </w:p>
     <w:p>
       <w:pPr>
-        <w:pStyle w:val="Heading3"/>
-      </w:pPr>
-      <w:bookmarkStart w:id="61" w:name="_Toc226533092"/>
-      <w:r>
-        <w:t>9.7.1 docker-compose.yml</w:t>
+        <w:pStyle w:val="Heading2"/>
+      </w:pPr>
+      <w:bookmarkStart w:id="61" w:name="_Toc226552651"/>
+      <w:r>
+        <w:t>9.6 REST-API Dokumentation</w:t>
       </w:r>
       <w:bookmarkEnd w:id="61"/>
     </w:p>
@@ -20426,89 +21149,77 @@
       <w:pPr>
         <w:pStyle w:val="Heading3"/>
       </w:pPr>
-      <w:bookmarkStart w:id="62" w:name="_Toc226533093"/>
-      <w:r>
-        <w:t>9.7.2 Netzwerkkonfigurationen</w:t>
+      <w:bookmarkStart w:id="62" w:name="_Toc226552652"/>
+      <w:r>
+        <w:t>9.6.1 Request / Response Beispiele</w:t>
       </w:r>
       <w:bookmarkEnd w:id="62"/>
     </w:p>
     <w:p>
       <w:pPr>
+        <w:pStyle w:val="Heading2"/>
+      </w:pPr>
+      <w:bookmarkStart w:id="63" w:name="_Toc226552653"/>
+      <w:r>
+        <w:t>9.7 Docker-Setup</w:t>
+      </w:r>
+      <w:bookmarkEnd w:id="63"/>
+    </w:p>
+    <w:p>
+      <w:pPr>
         <w:pStyle w:val="Heading3"/>
       </w:pPr>
-      <w:bookmarkStart w:id="63" w:name="_Toc226533094"/>
+      <w:bookmarkStart w:id="64" w:name="_Toc226552654"/>
+      <w:r>
+        <w:t>9.7.1 docker-compose.yml</w:t>
+      </w:r>
+      <w:bookmarkEnd w:id="64"/>
+    </w:p>
+    <w:p>
+      <w:pPr>
+        <w:pStyle w:val="Heading3"/>
+      </w:pPr>
+      <w:bookmarkStart w:id="65" w:name="_Toc226552655"/>
+      <w:r>
+        <w:t>9.7.2 Netzwerkkonfigurationen</w:t>
+      </w:r>
+      <w:bookmarkEnd w:id="65"/>
+    </w:p>
+    <w:p>
+      <w:pPr>
+        <w:pStyle w:val="Heading3"/>
+      </w:pPr>
+      <w:bookmarkStart w:id="66" w:name="_Toc226552656"/>
       <w:r>
         <w:t>9.7.2 Umgebungsvariabel</w:t>
       </w:r>
       <w:r>
         <w:t>n</w:t>
       </w:r>
-      <w:bookmarkEnd w:id="63"/>
+      <w:bookmarkEnd w:id="66"/>
     </w:p>
     <w:p/>
     <w:p>
       <w:pPr>
         <w:pStyle w:val="Heading2"/>
       </w:pPr>
-      <w:bookmarkStart w:id="64" w:name="_Toc226533095"/>
+      <w:bookmarkStart w:id="67" w:name="_Toc226552657"/>
       <w:r>
         <w:lastRenderedPageBreak/>
         <w:t>9.8 Frontend – Screens und Komponenten</w:t>
       </w:r>
-      <w:bookmarkEnd w:id="64"/>
+      <w:bookmarkEnd w:id="67"/>
     </w:p>
     <w:p>
       <w:pPr>
         <w:pStyle w:val="Heading3"/>
       </w:pPr>
-      <w:bookmarkStart w:id="65" w:name="_Toc226533096"/>
+      <w:bookmarkStart w:id="68" w:name="_Toc226552658"/>
       <w:r>
         <w:t>9.8.1</w:t>
       </w:r>
       <w:r>
         <w:t xml:space="preserve"> Screen 1 - Login</w:t>
-      </w:r>
-      <w:bookmarkEnd w:id="65"/>
-    </w:p>
-    <w:p>
-      <w:pPr>
-        <w:pStyle w:val="Heading3"/>
-      </w:pPr>
-      <w:bookmarkStart w:id="66" w:name="_Toc226533097"/>
-      <w:r>
-        <w:t>9.8.2</w:t>
-      </w:r>
-      <w:r>
-        <w:t xml:space="preserve"> Screen 2 – Template Übersicht</w:t>
-      </w:r>
-      <w:bookmarkEnd w:id="66"/>
-    </w:p>
-    <w:p>
-      <w:pPr>
-        <w:pStyle w:val="Heading3"/>
-      </w:pPr>
-      <w:bookmarkStart w:id="67" w:name="_Toc226533098"/>
-      <w:r>
-        <w:t>9.8.</w:t>
-      </w:r>
-      <w:r>
-        <w:t>3 Screen 3 – Dokumenten Übersicht</w:t>
-      </w:r>
-      <w:bookmarkEnd w:id="67"/>
-      <w:r>
-        <w:t xml:space="preserve"> </w:t>
-      </w:r>
-    </w:p>
-    <w:p>
-      <w:pPr>
-        <w:pStyle w:val="Heading3"/>
-      </w:pPr>
-      <w:bookmarkStart w:id="68" w:name="_Toc226533099"/>
-      <w:r>
-        <w:t>9.8.4</w:t>
-      </w:r>
-      <w:r>
-        <w:t xml:space="preserve"> Screen 4 – SAD-Editor</w:t>
       </w:r>
       <w:bookmarkEnd w:id="68"/>
     </w:p>
@@ -20516,48 +21227,54 @@
       <w:pPr>
         <w:pStyle w:val="Heading3"/>
       </w:pPr>
-      <w:bookmarkStart w:id="69" w:name="_Toc226533100"/>
-      <w:r>
-        <w:t>9.8.5</w:t>
-      </w:r>
-      <w:r>
-        <w:t xml:space="preserve"> Konsistenz und Screen-Flow</w:t>
+      <w:bookmarkStart w:id="69" w:name="_Toc226552659"/>
+      <w:r>
+        <w:t>9.8.2</w:t>
+      </w:r>
+      <w:r>
+        <w:t xml:space="preserve"> Screen 2 – Template Übersicht</w:t>
       </w:r>
       <w:bookmarkEnd w:id="69"/>
     </w:p>
     <w:p>
       <w:pPr>
-        <w:pStyle w:val="Heading2"/>
-      </w:pPr>
-      <w:bookmarkStart w:id="70" w:name="_Toc226533101"/>
-      <w:r>
-        <w:t>9.9 Sicherheitsmassnahmen – gesamtüberblick</w:t>
+        <w:pStyle w:val="Heading3"/>
+      </w:pPr>
+      <w:bookmarkStart w:id="70" w:name="_Toc226552660"/>
+      <w:r>
+        <w:t>9.8.</w:t>
+      </w:r>
+      <w:r>
+        <w:t>3 Screen 3 – Dokumenten Übersicht</w:t>
       </w:r>
       <w:bookmarkEnd w:id="70"/>
+      <w:r>
+        <w:t xml:space="preserve"> </w:t>
+      </w:r>
     </w:p>
     <w:p>
       <w:pPr>
-        <w:pStyle w:val="Heading2"/>
-      </w:pPr>
-      <w:bookmarkStart w:id="71" w:name="_Toc226533102"/>
-      <w:r>
-        <w:t>9.10 Versionierung (</w:t>
-      </w:r>
-      <w:r>
-        <w:t>GitHub</w:t>
-      </w:r>
-      <w:r>
-        <w:t>)</w:t>
+        <w:pStyle w:val="Heading3"/>
+      </w:pPr>
+      <w:bookmarkStart w:id="71" w:name="_Toc226552661"/>
+      <w:r>
+        <w:t>9.8.4</w:t>
+      </w:r>
+      <w:r>
+        <w:t xml:space="preserve"> Screen 4 – SAD-Editor</w:t>
       </w:r>
       <w:bookmarkEnd w:id="71"/>
     </w:p>
     <w:p>
       <w:pPr>
-        <w:pStyle w:val="Heading1"/>
-      </w:pPr>
-      <w:bookmarkStart w:id="72" w:name="_Toc226533103"/>
-      <w:r>
-        <w:t>10. Kontrollieren – Testing</w:t>
+        <w:pStyle w:val="Heading3"/>
+      </w:pPr>
+      <w:bookmarkStart w:id="72" w:name="_Toc226552662"/>
+      <w:r>
+        <w:t>9.8.5</w:t>
+      </w:r>
+      <w:r>
+        <w:t xml:space="preserve"> Konsistenz und Screen-Flow</w:t>
       </w:r>
       <w:bookmarkEnd w:id="72"/>
     </w:p>
@@ -20565,9 +21282,9 @@
       <w:pPr>
         <w:pStyle w:val="Heading2"/>
       </w:pPr>
-      <w:bookmarkStart w:id="73" w:name="_Toc226533104"/>
-      <w:r>
-        <w:t>10.1 Testinfrastruktur und Testumfeld</w:t>
+      <w:bookmarkStart w:id="73" w:name="_Toc226552663"/>
+      <w:r>
+        <w:t>9.9 Sicherheitsmassnahmen – gesamtüberblick</w:t>
       </w:r>
       <w:bookmarkEnd w:id="73"/>
     </w:p>
@@ -20575,19 +21292,141 @@
       <w:pPr>
         <w:pStyle w:val="Heading2"/>
       </w:pPr>
-      <w:bookmarkStart w:id="74" w:name="_Toc226533105"/>
-      <w:r>
-        <w:t>10.2 Testarten und Begründung</w:t>
+      <w:bookmarkStart w:id="74" w:name="_Toc226552664"/>
+      <w:r>
+        <w:t>9.10 Versionierung (</w:t>
+      </w:r>
+      <w:r>
+        <w:t>GitHub</w:t>
+      </w:r>
+      <w:r>
+        <w:t xml:space="preserve"> &amp; OneDrive</w:t>
+      </w:r>
+      <w:r>
+        <w:t>)</w:t>
       </w:r>
       <w:bookmarkEnd w:id="74"/>
     </w:p>
     <w:p>
       <w:pPr>
-        <w:pStyle w:val="Heading2"/>
-      </w:pPr>
-      <w:bookmarkStart w:id="75" w:name="_Toc226533106"/>
-      <w:r>
-        <w:t>10.3 Testdrehbuch</w:t>
+        <w:pStyle w:val="Heading3"/>
+      </w:pPr>
+      <w:r>
+        <w:t>9.10.1 GitHub</w:t>
+      </w:r>
+    </w:p>
+    <w:p>
+      <w:r>
+        <w:t xml:space="preserve">Der gesamte Code </w:t>
+      </w:r>
+      <w:r>
+        <w:t>des Projekts</w:t>
+      </w:r>
+      <w:r>
+        <w:t xml:space="preserve"> wird täglich </w:t>
+      </w:r>
+      <w:r>
+        <w:t xml:space="preserve">auf dieses Repository </w:t>
+      </w:r>
+      <w:proofErr w:type="spellStart"/>
+      <w:r>
+        <w:t>commited</w:t>
+      </w:r>
+      <w:proofErr w:type="spellEnd"/>
+      <w:r>
+        <w:t xml:space="preserve"> und gepusht: </w:t>
+      </w:r>
+      <w:hyperlink r:id="rId31" w:history="1">
+        <w:r>
+          <w:rPr>
+            <w:rStyle w:val="Hyperlink"/>
+          </w:rPr>
+          <w:t>https://github.com/rubenschneebeli/IPA_SAD_Tool</w:t>
+        </w:r>
+      </w:hyperlink>
+    </w:p>
+    <w:p>
+      <w:r>
+        <w:rPr>
+          <w:highlight w:val="yellow"/>
+        </w:rPr>
+        <w:t xml:space="preserve">Hier später noch </w:t>
+      </w:r>
+      <w:proofErr w:type="spellStart"/>
+      <w:r>
+        <w:rPr>
+          <w:highlight w:val="yellow"/>
+        </w:rPr>
+        <w:t>screenshot</w:t>
+      </w:r>
+      <w:proofErr w:type="spellEnd"/>
+      <w:r>
+        <w:rPr>
+          <w:highlight w:val="yellow"/>
+        </w:rPr>
+        <w:t xml:space="preserve"> von den </w:t>
+      </w:r>
+      <w:proofErr w:type="spellStart"/>
+      <w:r>
+        <w:rPr>
+          <w:highlight w:val="yellow"/>
+        </w:rPr>
+        <w:t>commits</w:t>
+      </w:r>
+      <w:proofErr w:type="spellEnd"/>
+    </w:p>
+    <w:p>
+      <w:pPr>
+        <w:pStyle w:val="Heading3"/>
+      </w:pPr>
+      <w:r>
+        <w:t>9.10.2 OneDrive</w:t>
+      </w:r>
+    </w:p>
+    <w:p>
+      <w:r>
+        <w:t>Der IPA-Bericht und d</w:t>
+      </w:r>
+      <w:r>
+        <w:t xml:space="preserve">er IPA-Zeitplan </w:t>
+      </w:r>
+      <w:r>
+        <w:t>werden</w:t>
+      </w:r>
+      <w:r>
+        <w:t xml:space="preserve"> automatisch bei Änderungen auf OneDrive gesichert. Dadurch ist sichergestellt</w:t>
+      </w:r>
+      <w:r>
+        <w:t xml:space="preserve">, dass bei einem lokalen Geräteausfall keine Arbeit verloren geht. Zusätzlich wird jeden Abend </w:t>
+      </w:r>
+      <w:r>
+        <w:t>eine Kopie vom Bericht gemacht und auf dem Repository gespeichert.</w:t>
+      </w:r>
+    </w:p>
+    <w:p>
+      <w:r>
+        <w:rPr>
+          <w:highlight w:val="yellow"/>
+        </w:rPr>
+        <w:t xml:space="preserve">Später </w:t>
+      </w:r>
+      <w:r>
+        <w:rPr>
+          <w:highlight w:val="yellow"/>
+        </w:rPr>
+        <w:t>Screenshot vom Bericht im Repo zeigen</w:t>
+      </w:r>
+      <w:r>
+        <w:t xml:space="preserve"> </w:t>
+      </w:r>
+    </w:p>
+    <w:p>
+      <w:pPr>
+        <w:pStyle w:val="Heading1"/>
+      </w:pPr>
+      <w:bookmarkStart w:id="75" w:name="_Toc226552665"/>
+      <w:r>
+        <w:t>10. Kontrollieren – Testing</w:t>
       </w:r>
       <w:bookmarkEnd w:id="75"/>
     </w:p>
@@ -20595,9 +21434,9 @@
       <w:pPr>
         <w:pStyle w:val="Heading2"/>
       </w:pPr>
-      <w:bookmarkStart w:id="76" w:name="_Toc226533107"/>
-      <w:r>
-        <w:t>10.4 Testbericht</w:t>
+      <w:bookmarkStart w:id="76" w:name="_Toc226552666"/>
+      <w:r>
+        <w:t>10.1 Testinfrastruktur und Testumfeld</w:t>
       </w:r>
       <w:bookmarkEnd w:id="76"/>
     </w:p>
@@ -20605,33 +21444,29 @@
       <w:pPr>
         <w:pStyle w:val="Heading2"/>
       </w:pPr>
-      <w:bookmarkStart w:id="77" w:name="_Toc226533108"/>
-      <w:r>
-        <w:t>10.5 Verbesserungspotenzial und Nacharbeiten</w:t>
+      <w:bookmarkStart w:id="77" w:name="_Toc226552667"/>
+      <w:r>
+        <w:t>10.2 Testarten und Begründung</w:t>
       </w:r>
       <w:bookmarkEnd w:id="77"/>
     </w:p>
-    <w:p/>
     <w:p>
       <w:pPr>
-        <w:pStyle w:val="Heading1"/>
-      </w:pPr>
-      <w:bookmarkStart w:id="78" w:name="_Toc226533109"/>
-      <w:r>
-        <w:t>11. Auswerten</w:t>
+        <w:pStyle w:val="Heading2"/>
+      </w:pPr>
+      <w:bookmarkStart w:id="78" w:name="_Toc226552668"/>
+      <w:r>
+        <w:t>10.3 Testdrehbuch</w:t>
       </w:r>
       <w:bookmarkEnd w:id="78"/>
-      <w:r>
-        <w:t xml:space="preserve"> </w:t>
-      </w:r>
     </w:p>
     <w:p>
       <w:pPr>
         <w:pStyle w:val="Heading2"/>
       </w:pPr>
-      <w:bookmarkStart w:id="79" w:name="_Toc226533110"/>
-      <w:r>
-        <w:t>11.1 Zielerreichung</w:t>
+      <w:bookmarkStart w:id="79" w:name="_Toc226552669"/>
+      <w:r>
+        <w:t>10.4 Testbericht</w:t>
       </w:r>
       <w:bookmarkEnd w:id="79"/>
     </w:p>
@@ -20639,9 +21474,9 @@
       <w:pPr>
         <w:pStyle w:val="Heading2"/>
       </w:pPr>
-      <w:bookmarkStart w:id="80" w:name="_Toc226533111"/>
-      <w:r>
-        <w:t>11.2 Reflexion</w:t>
+      <w:bookmarkStart w:id="80" w:name="_Toc226552670"/>
+      <w:r>
+        <w:t>10.5 Verbesserungspotenzial und Nacharbeiten</w:t>
       </w:r>
       <w:bookmarkEnd w:id="80"/>
     </w:p>
@@ -20650,20 +21485,23 @@
       <w:pPr>
         <w:pStyle w:val="Heading1"/>
       </w:pPr>
-      <w:bookmarkStart w:id="81" w:name="_Toc226533112"/>
+      <w:bookmarkStart w:id="81" w:name="_Toc226552671"/>
       <w:r>
         <w:lastRenderedPageBreak/>
-        <w:t>12. Installationsanweisung</w:t>
+        <w:t>11. Auswerten</w:t>
       </w:r>
       <w:bookmarkEnd w:id="81"/>
+      <w:r>
+        <w:t xml:space="preserve"> </w:t>
+      </w:r>
     </w:p>
     <w:p>
       <w:pPr>
         <w:pStyle w:val="Heading2"/>
       </w:pPr>
-      <w:bookmarkStart w:id="82" w:name="_Toc226533113"/>
-      <w:r>
-        <w:t>12.1 Systemvoraussetzungen</w:t>
+      <w:bookmarkStart w:id="82" w:name="_Toc226552672"/>
+      <w:r>
+        <w:t>11.1 Zielerreichung</w:t>
       </w:r>
       <w:bookmarkEnd w:id="82"/>
     </w:p>
@@ -20671,30 +21509,30 @@
       <w:pPr>
         <w:pStyle w:val="Heading2"/>
       </w:pPr>
-      <w:bookmarkStart w:id="83" w:name="_Toc226533114"/>
-      <w:r>
-        <w:t>12.2 Installation und Start</w:t>
+      <w:bookmarkStart w:id="83" w:name="_Toc226552673"/>
+      <w:r>
+        <w:t>11.2 Reflexion</w:t>
       </w:r>
       <w:bookmarkEnd w:id="83"/>
-    </w:p>
-    <w:p>
-      <w:pPr>
-        <w:pStyle w:val="Heading2"/>
-      </w:pPr>
-      <w:bookmarkStart w:id="84" w:name="_Toc226533115"/>
-      <w:r>
-        <w:t>12.3 Konfigurationsparameter</w:t>
-      </w:r>
-      <w:bookmarkEnd w:id="84"/>
     </w:p>
     <w:p/>
     <w:p>
       <w:pPr>
         <w:pStyle w:val="Heading1"/>
       </w:pPr>
-      <w:bookmarkStart w:id="85" w:name="_Toc226533116"/>
-      <w:r>
-        <w:t>13. Benutzeranleitung</w:t>
+      <w:bookmarkStart w:id="84" w:name="_Toc226552674"/>
+      <w:r>
+        <w:t>12. Installationsanweisung</w:t>
+      </w:r>
+      <w:bookmarkEnd w:id="84"/>
+    </w:p>
+    <w:p>
+      <w:pPr>
+        <w:pStyle w:val="Heading2"/>
+      </w:pPr>
+      <w:bookmarkStart w:id="85" w:name="_Toc226552675"/>
+      <w:r>
+        <w:t>12.1 Systemvoraussetzungen</w:t>
       </w:r>
       <w:bookmarkEnd w:id="85"/>
     </w:p>
@@ -20702,9 +21540,9 @@
       <w:pPr>
         <w:pStyle w:val="Heading2"/>
       </w:pPr>
-      <w:bookmarkStart w:id="86" w:name="_Toc226533117"/>
-      <w:r>
-        <w:t>13.1 Login</w:t>
+      <w:bookmarkStart w:id="86" w:name="_Toc226552676"/>
+      <w:r>
+        <w:t>12.2 Installation und Start</w:t>
       </w:r>
       <w:bookmarkEnd w:id="86"/>
     </w:p>
@@ -20712,25 +21550,20 @@
       <w:pPr>
         <w:pStyle w:val="Heading2"/>
       </w:pPr>
-      <w:bookmarkStart w:id="87" w:name="_Toc226533118"/>
-      <w:r>
-        <w:t>13.2 Template erstellen un</w:t>
-      </w:r>
-      <w:r>
-        <w:t>d</w:t>
-      </w:r>
-      <w:r>
-        <w:t xml:space="preserve"> verwalten</w:t>
+      <w:bookmarkStart w:id="87" w:name="_Toc226552677"/>
+      <w:r>
+        <w:t>12.3 Konfigurationsparameter</w:t>
       </w:r>
       <w:bookmarkEnd w:id="87"/>
     </w:p>
+    <w:p/>
     <w:p>
       <w:pPr>
-        <w:pStyle w:val="Heading2"/>
-      </w:pPr>
-      <w:bookmarkStart w:id="88" w:name="_Toc226533119"/>
-      <w:r>
-        <w:t>13.3 SAD-Dokument erstellen und bearbeiten</w:t>
+        <w:pStyle w:val="Heading1"/>
+      </w:pPr>
+      <w:bookmarkStart w:id="88" w:name="_Toc226552678"/>
+      <w:r>
+        <w:t>13. Benutzeranleitung</w:t>
       </w:r>
       <w:bookmarkEnd w:id="88"/>
     </w:p>
@@ -20738,63 +21571,100 @@
       <w:pPr>
         <w:pStyle w:val="Heading2"/>
       </w:pPr>
-      <w:bookmarkStart w:id="89" w:name="_Toc226533120"/>
+      <w:bookmarkStart w:id="89" w:name="_Toc226552679"/>
+      <w:r>
+        <w:t>13.1 Login</w:t>
+      </w:r>
+      <w:bookmarkEnd w:id="89"/>
+    </w:p>
+    <w:p>
+      <w:pPr>
+        <w:pStyle w:val="Heading2"/>
+      </w:pPr>
+      <w:bookmarkStart w:id="90" w:name="_Toc226552680"/>
+      <w:r>
+        <w:t>13.2 Template erstellen un</w:t>
+      </w:r>
+      <w:r>
+        <w:t>d</w:t>
+      </w:r>
+      <w:r>
+        <w:t xml:space="preserve"> verwalten</w:t>
+      </w:r>
+      <w:bookmarkEnd w:id="90"/>
+    </w:p>
+    <w:p>
+      <w:pPr>
+        <w:pStyle w:val="Heading2"/>
+      </w:pPr>
+      <w:bookmarkStart w:id="91" w:name="_Toc226552681"/>
+      <w:r>
+        <w:t>13.3 SAD-Dokument erstellen und bearbeiten</w:t>
+      </w:r>
+      <w:bookmarkEnd w:id="91"/>
+    </w:p>
+    <w:p>
+      <w:pPr>
+        <w:pStyle w:val="Heading2"/>
+      </w:pPr>
+      <w:bookmarkStart w:id="92" w:name="_Toc226552682"/>
       <w:r>
         <w:t>13.4 PDF-Export</w:t>
       </w:r>
-      <w:bookmarkEnd w:id="89"/>
+      <w:bookmarkEnd w:id="92"/>
     </w:p>
     <w:p/>
     <w:p>
       <w:pPr>
         <w:pStyle w:val="Heading1"/>
       </w:pPr>
-      <w:bookmarkStart w:id="90" w:name="_Toc226533121"/>
+      <w:bookmarkStart w:id="93" w:name="_Toc226552683"/>
       <w:r>
         <w:t>14. Glossar</w:t>
       </w:r>
-      <w:bookmarkEnd w:id="90"/>
+      <w:bookmarkEnd w:id="93"/>
     </w:p>
     <w:p/>
     <w:p>
       <w:pPr>
         <w:pStyle w:val="Heading1"/>
       </w:pPr>
-      <w:bookmarkStart w:id="91" w:name="_Toc226533122"/>
-      <w:r>
+      <w:bookmarkStart w:id="94" w:name="_Toc226552684"/>
+      <w:r>
+        <w:lastRenderedPageBreak/>
         <w:t>15. Literaturverzeichnis</w:t>
       </w:r>
-      <w:bookmarkEnd w:id="91"/>
+      <w:bookmarkEnd w:id="94"/>
     </w:p>
     <w:p>
       <w:pPr>
         <w:pStyle w:val="Heading1"/>
       </w:pPr>
-      <w:bookmarkStart w:id="92" w:name="_Toc226533123"/>
+      <w:bookmarkStart w:id="95" w:name="_Toc226552685"/>
       <w:r>
         <w:t>16. Anhang</w:t>
       </w:r>
-      <w:bookmarkEnd w:id="92"/>
+      <w:bookmarkEnd w:id="95"/>
     </w:p>
     <w:p>
       <w:pPr>
         <w:pStyle w:val="Heading2"/>
       </w:pPr>
-      <w:bookmarkStart w:id="93" w:name="_Toc226533124"/>
+      <w:bookmarkStart w:id="96" w:name="_Toc226552686"/>
       <w:r>
         <w:t>16.1 Verzeichnisse</w:t>
       </w:r>
-      <w:bookmarkEnd w:id="93"/>
+      <w:bookmarkEnd w:id="96"/>
     </w:p>
     <w:p>
       <w:pPr>
         <w:pStyle w:val="Heading3"/>
       </w:pPr>
-      <w:bookmarkStart w:id="94" w:name="_Toc226533125"/>
+      <w:bookmarkStart w:id="97" w:name="_Toc226552687"/>
       <w:r>
         <w:t>16.1.1 Tabellenverzeichnis</w:t>
       </w:r>
-      <w:bookmarkEnd w:id="94"/>
+      <w:bookmarkEnd w:id="97"/>
     </w:p>
     <w:p>
       <w:pPr>
@@ -20893,21 +21763,7 @@
             <w:rStyle w:val="Hyperlink"/>
             <w:noProof/>
           </w:rPr>
-          <w:t>Tabelle 2 - Risikomanagem</w:t>
-        </w:r>
-        <w:r>
-          <w:rPr>
-            <w:rStyle w:val="Hyperlink"/>
-            <w:noProof/>
-          </w:rPr>
-          <w:t>e</w:t>
-        </w:r>
-        <w:r>
-          <w:rPr>
-            <w:rStyle w:val="Hyperlink"/>
-            <w:noProof/>
-          </w:rPr>
-          <w:t>nt Tabelle</w:t>
+          <w:t>Tabelle 2 - Risikomanagement Tabelle</w:t>
         </w:r>
         <w:r>
           <w:rPr>
@@ -21108,15 +21964,14 @@
       <w:pPr>
         <w:pStyle w:val="Heading3"/>
       </w:pPr>
-      <w:bookmarkStart w:id="95" w:name="_Toc226533126"/>
-      <w:r>
-        <w:lastRenderedPageBreak/>
+      <w:bookmarkStart w:id="98" w:name="_Toc226552688"/>
+      <w:r>
         <w:t xml:space="preserve">16.1.2 </w:t>
       </w:r>
       <w:r>
         <w:t>Grafikverzeichnis</w:t>
       </w:r>
-      <w:bookmarkEnd w:id="95"/>
+      <w:bookmarkEnd w:id="98"/>
     </w:p>
     <w:p>
       <w:pPr>
@@ -21346,18 +22201,18 @@
       <w:pPr>
         <w:pStyle w:val="Heading3"/>
       </w:pPr>
-      <w:bookmarkStart w:id="96" w:name="_Toc226533127"/>
+      <w:bookmarkStart w:id="99" w:name="_Toc226552689"/>
       <w:r>
         <w:t>16.1.3 Quellenverzeichnis</w:t>
       </w:r>
-      <w:bookmarkEnd w:id="96"/>
+      <w:bookmarkEnd w:id="99"/>
     </w:p>
     <w:p/>
     <w:p/>
     <w:p/>
     <w:sectPr>
-      <w:headerReference w:type="default" r:id="rId30"/>
-      <w:footerReference w:type="default" r:id="rId31"/>
+      <w:headerReference w:type="default" r:id="rId32"/>
+      <w:footerReference w:type="default" r:id="rId33"/>
       <w:pgSz w:w="11906" w:h="16838"/>
       <w:pgMar w:top="1440" w:right="1440" w:bottom="1440" w:left="1440" w:header="708" w:footer="708" w:gutter="0"/>
       <w:cols w:space="708"/>

</xml_diff>